<commit_message>
Informe: mejorar espaciado, redacción e introducción/conclusión en hojas propias
Co-Authored-By: Claude Opus 5.5 <noreply@anthropic.com>
Claude-Session: https://claude.ai/code/session_01HCcWDiVbyCTL38FrJBx768
</commit_message>
<xml_diff>
--- a/Informe_Factibilidad_Antirrobo_IoT.docx
+++ b/Informe_Factibilidad_Antirrobo_IoT.docx
@@ -235,7 +235,7 @@
     </w:p>
     <w:p>
       <w:pPr>
-        <w:spacing w:after="120" w:line="240" w:lineRule="auto"/>
+        <w:spacing w:after="200" w:line="276" w:lineRule="auto"/>
         <w:jc w:val="both"/>
       </w:pPr>
       <w:r>
@@ -244,7 +244,7 @@
           <w:sz w:val="22"/>
           <w:szCs w:val="22"/>
         </w:rPr>
-        <w:t xml:space="preserve">El presente informe analizó la factibilidad de un </w:t>
+        <w:t xml:space="preserve">Hoy en día la seguridad de hogares y negocios ya no depende solo de cerraduras o guardias. Gracias al Internet de las Cosas (IoT) es posible tener sensores que avisan al instante, desde cualquier lugar, cuando algo extraño ocurre. Con esa idea se desarrolló un </w:t>
       </w:r>
       <w:r>
         <w:rPr>
@@ -254,36 +254,16 @@
           <w:sz w:val="22"/>
           <w:szCs w:val="22"/>
         </w:rPr>
-        <w:t xml:space="preserve">Sistema Antirrobo Inteligente basado en Arduino UNO R4 WiFi e IoT</w:t>
-      </w:r>
-      <w:r>
-        <w:rPr>
-          <w:rFonts w:ascii="Arial" w:hAnsi="Arial" w:cs="Arial"/>
-          <w:sz w:val="22"/>
-          <w:szCs w:val="22"/>
-        </w:rPr>
-        <w:t xml:space="preserve">. La solución detectó intrusiones combinando tres variables —sonido, oscuridad y proximidad— y notificó cada evento en tiempo real a una aplicación web con inicio de sesión, alertas por SMS y push, cámara en vivo y reconocimiento facial.</w:t>
-      </w:r>
-    </w:p>
-    <w:p>
-      <w:pPr>
-        <w:spacing w:after="120" w:line="240" w:lineRule="auto"/>
-        <w:jc w:val="both"/>
-      </w:pPr>
-      <w:r>
-        <w:rPr>
-          <w:rFonts w:ascii="Arial" w:hAnsi="Arial" w:cs="Arial"/>
-          <w:sz w:val="22"/>
-          <w:szCs w:val="22"/>
-        </w:rPr>
-        <w:t xml:space="preserve">En el desarrollo se justificó la selección del microcontrolador, la integración de sensores y actuadores, la comunicación WiFi y su seguridad, el diseño de la aplicación y su integración con el hardware, y se evaluaron tres entornos de implementación considerando factibilidad técnica y económica, estándares OT, limitaciones y recomendaciones.</w:t>
-      </w:r>
-    </w:p>
-    <w:p>
-      <w:pPr>
-        <w:spacing w:after="120" w:line="240" w:lineRule="auto"/>
-        <w:jc w:val="both"/>
-      </w:pPr>
+        <w:t xml:space="preserve">Sistema Antirrobo Inteligente</w:t>
+      </w:r>
+      <w:r>
+        <w:rPr>
+          <w:rFonts w:ascii="Arial" w:hAnsi="Arial" w:cs="Arial"/>
+          <w:sz w:val="22"/>
+          <w:szCs w:val="22"/>
+        </w:rPr>
+        <w:t xml:space="preserve"> basado en la placa </w:t>
+      </w:r>
       <w:r>
         <w:rPr>
           <w:rFonts w:ascii="Arial" w:hAnsi="Arial" w:cs="Arial"/>
@@ -292,15 +272,62 @@
           <w:sz w:val="22"/>
           <w:szCs w:val="22"/>
         </w:rPr>
-        <w:t xml:space="preserve">Objetivo general:</w:t>
-      </w:r>
-      <w:r>
-        <w:rPr>
-          <w:rFonts w:ascii="Arial" w:hAnsi="Arial" w:cs="Arial"/>
-          <w:sz w:val="22"/>
-          <w:szCs w:val="22"/>
-        </w:rPr>
-        <w:t xml:space="preserve"> evaluar la factibilidad técnica y económica de implementar el sistema antirrobo IoT en distintos entornos, considerando hardware, comunicación inalámbrica, seguridad y aplicación.</w:t>
+        <w:t xml:space="preserve">Arduino UNO R4 WiFi</w:t>
+      </w:r>
+      <w:r>
+        <w:rPr>
+          <w:rFonts w:ascii="Arial" w:hAnsi="Arial" w:cs="Arial"/>
+          <w:sz w:val="22"/>
+          <w:szCs w:val="22"/>
+        </w:rPr>
+        <w:t xml:space="preserve">, capaz de detectar intrusiones y notificarlas en tiempo real a una aplicación web.</w:t>
+      </w:r>
+    </w:p>
+    <w:p>
+      <w:pPr>
+        <w:spacing w:after="200" w:line="276" w:lineRule="auto"/>
+        <w:jc w:val="both"/>
+      </w:pPr>
+      <w:r>
+        <w:rPr>
+          <w:rFonts w:ascii="Arial" w:hAnsi="Arial" w:cs="Arial"/>
+          <w:sz w:val="22"/>
+          <w:szCs w:val="22"/>
+        </w:rPr>
+        <w:t xml:space="preserve">El sistema combina tres sensores (sonido, luz y distancia) para decidir si hay un intruso, y envía la información a un servidor en la nube. Desde ahí, el usuario puede ver el estado en vivo, revisar un historial con fotografías, recibir alertas por SMS y notificaciones en el teléfono, e incluso observar una cámara en vivo con reconocimiento facial.</w:t>
+      </w:r>
+    </w:p>
+    <w:p>
+      <w:pPr>
+        <w:spacing w:after="200" w:line="276" w:lineRule="auto"/>
+        <w:jc w:val="both"/>
+      </w:pPr>
+      <w:r>
+        <w:rPr>
+          <w:rFonts w:ascii="Arial" w:hAnsi="Arial" w:cs="Arial"/>
+          <w:sz w:val="22"/>
+          <w:szCs w:val="22"/>
+        </w:rPr>
+        <w:t xml:space="preserve">En este informe se analizó la factibilidad de esta solución. Primero se explicó cómo se eligió el microcontrolador y cómo se integraron los sensores y actuadores; luego, cómo se configuró la comunicación WiFi y qué medidas de seguridad se aplicaron; después, cómo se diseñó la aplicación y cómo se comunica con el hardware. Por último, se evaluaron tres entornos donde podría implementarse, considerando su factibilidad técnica y económica, los estándares OT y sus principales limitaciones.</w:t>
+      </w:r>
+    </w:p>
+    <w:p>
+      <w:pPr>
+        <w:spacing w:after="200" w:line="276" w:lineRule="auto"/>
+        <w:jc w:val="both"/>
+      </w:pPr>
+      <w:r>
+        <w:rPr>
+          <w:rFonts w:ascii="Arial" w:hAnsi="Arial" w:cs="Arial"/>
+          <w:sz w:val="22"/>
+          <w:szCs w:val="22"/>
+        </w:rPr>
+        <w:t xml:space="preserve">El objetivo general fue evaluar si el sistema antirrobo IoT es viable técnica y económicamente para ser implementado en distintos entornos, considerando su hardware, su comunicación inalámbrica, su seguridad y la aplicación asociada.</w:t>
+      </w:r>
+    </w:p>
+    <w:p>
+      <w:r>
+        <w:br w:type="page"/>
       </w:r>
     </w:p>
     <w:p>
@@ -315,14 +342,28 @@
     </w:p>
     <w:p>
       <w:pPr>
+        <w:spacing w:after="200" w:line="276" w:lineRule="auto"/>
+        <w:jc w:val="both"/>
+      </w:pPr>
+      <w:r>
+        <w:rPr>
+          <w:rFonts w:ascii="Arial" w:hAnsi="Arial" w:cs="Arial"/>
+          <w:sz w:val="22"/>
+          <w:szCs w:val="22"/>
+        </w:rPr>
+        <w:t xml:space="preserve">La Figura 1 muestra cómo se relacionan las partes del sistema. Los sensores entregan sus lecturas al Arduino, que decide si hay una intrusión y envía los datos cada segundo a un servidor en Render. Este servidor los reenvía de inmediato a la aplicación y se encarga de enviar los avisos por SMS y notificación push.</w:t>
+      </w:r>
+    </w:p>
+    <w:p>
+      <w:pPr>
         <w:keepNext/>
-        <w:spacing w:before="120" w:after="0"/>
+        <w:spacing w:before="240" w:after="0"/>
         <w:jc w:val="center"/>
       </w:pPr>
       <w:r>
         <w:drawing>
           <wp:inline distT="0" distB="0" distL="0" distR="0">
-            <wp:extent cx="5580000" cy="2590714"/>
+            <wp:extent cx="5400000" cy="2507142"/>
             <wp:docPr id="101" name="Imagen 101"/>
             <a:graphic xmlns:a="http://schemas.openxmlformats.org/drawingml/2006/main">
               <a:graphicData uri="http://schemas.openxmlformats.org/drawingml/2006/picture">
@@ -340,7 +381,7 @@
                   <pic:spPr>
                     <a:xfrm>
                       <a:off x="0" y="0"/>
-                      <a:ext cx="5580000" cy="2590714"/>
+                      <a:ext cx="5400000" cy="2507142"/>
                     </a:xfrm>
                     <a:prstGeom prst="rect">
                       <a:avLst/>
@@ -355,7 +396,7 @@
     </w:p>
     <w:p>
       <w:pPr>
-        <w:spacing w:before="60" w:after="160"/>
+        <w:spacing w:before="100" w:after="280"/>
         <w:jc w:val="center"/>
       </w:pPr>
       <w:r>
@@ -393,34 +434,34 @@
     </w:p>
     <w:p>
       <w:pPr>
-        <w:spacing w:after="120" w:line="240" w:lineRule="auto"/>
-        <w:jc w:val="both"/>
-      </w:pPr>
-      <w:r>
-        <w:rPr>
-          <w:rFonts w:ascii="Arial" w:hAnsi="Arial" w:cs="Arial"/>
-          <w:sz w:val="22"/>
-          <w:szCs w:val="22"/>
-        </w:rPr>
-        <w:t xml:space="preserve">Se eligió el </w:t>
-      </w:r>
+        <w:keepNext/>
+        <w:spacing w:before="160" w:after="100"/>
+        <w:jc w:val="left"/>
+      </w:pPr>
       <w:r>
         <w:rPr>
           <w:rFonts w:ascii="Arial" w:hAnsi="Arial" w:cs="Arial"/>
           <w:b/>
           <w:bCs/>
-          <w:sz w:val="22"/>
-          <w:szCs w:val="22"/>
-        </w:rPr>
-        <w:t xml:space="preserve">Arduino UNO R4 WiFi</w:t>
-      </w:r>
-      <w:r>
-        <w:rPr>
-          <w:rFonts w:ascii="Arial" w:hAnsi="Arial" w:cs="Arial"/>
-          <w:sz w:val="22"/>
-          <w:szCs w:val="22"/>
-        </w:rPr>
-        <w:t xml:space="preserve"> porque, en una sola placa, ofrece lógica de 5 V compatible con todos los sensores, entradas analógicas y un coprocesador </w:t>
+          <w:color w:val="404040"/>
+          <w:sz w:val="22"/>
+          <w:szCs w:val="22"/>
+        </w:rPr>
+        <w:t xml:space="preserve">Selección del microcontrolador</w:t>
+      </w:r>
+    </w:p>
+    <w:p>
+      <w:pPr>
+        <w:spacing w:after="200" w:line="276" w:lineRule="auto"/>
+        <w:jc w:val="both"/>
+      </w:pPr>
+      <w:r>
+        <w:rPr>
+          <w:rFonts w:ascii="Arial" w:hAnsi="Arial" w:cs="Arial"/>
+          <w:sz w:val="22"/>
+          <w:szCs w:val="22"/>
+        </w:rPr>
+        <w:t xml:space="preserve">Para elegir la placa se compararon cuatro opciones (Tabla 1). Se optó por el </w:t>
       </w:r>
       <w:r>
         <w:rPr>
@@ -430,21 +471,21 @@
           <w:sz w:val="22"/>
           <w:szCs w:val="22"/>
         </w:rPr>
-        <w:t xml:space="preserve">ESP32-S3</w:t>
-      </w:r>
-      <w:r>
-        <w:rPr>
-          <w:rFonts w:ascii="Arial" w:hAnsi="Arial" w:cs="Arial"/>
-          <w:sz w:val="22"/>
-          <w:szCs w:val="22"/>
-        </w:rPr>
-        <w:t xml:space="preserve"> con WiFi capaz de conectarse por HTTPS (TLS) al servidor en la nube (Tabla 1).</w:t>
+        <w:t xml:space="preserve">Arduino UNO R4 WiFi</w:t>
+      </w:r>
+      <w:r>
+        <w:rPr>
+          <w:rFonts w:ascii="Arial" w:hAnsi="Arial" w:cs="Arial"/>
+          <w:sz w:val="22"/>
+          <w:szCs w:val="22"/>
+        </w:rPr>
+        <w:t xml:space="preserve"> porque trabaja a 5 V, igual que los sensores, por lo que se conectan directamente sin adaptadores. Además, trae un módulo ESP32-S3 con WiFi que permite conectarse de forma segura (HTTPS) al servidor. El ESP32 era más barato, pero trabaja a 3,3 V y habría obligado a agregar divisores de voltaje.</w:t>
       </w:r>
     </w:p>
     <w:p>
       <w:pPr>
         <w:keepNext/>
-        <w:spacing w:before="60" w:after="160"/>
+        <w:spacing w:before="100" w:after="280"/>
         <w:jc w:val="center"/>
       </w:pPr>
       <w:r>
@@ -501,11 +542,12 @@
             <w:tcW w:w="2200" w:type="dxa"/>
             <w:shd w:val="clear" w:color="auto" w:fill="C00000"/>
             <w:tcMar>
-              <w:top w:w="40" w:type="dxa"/>
-              <w:left w:w="80" w:type="dxa"/>
-              <w:bottom w:w="40" w:type="dxa"/>
-              <w:right w:w="80" w:type="dxa"/>
-            </w:tcMar>
+              <w:top w:w="70" w:type="dxa"/>
+              <w:left w:w="110" w:type="dxa"/>
+              <w:bottom w:w="70" w:type="dxa"/>
+              <w:right w:w="110" w:type="dxa"/>
+            </w:tcMar>
+            <w:vAlign w:val="center"/>
           </w:tcPr>
           <w:p>
             <w:pPr>
@@ -518,8 +560,8 @@
                 <w:b/>
                 <w:bCs/>
                 <w:color w:val="FFFFFF"/>
-                <w:sz w:val="16"/>
-                <w:szCs w:val="16"/>
+                <w:sz w:val="17"/>
+                <w:szCs w:val="17"/>
               </w:rPr>
               <w:t xml:space="preserve">Parámetro</w:t>
             </w:r>
@@ -530,11 +572,12 @@
             <w:tcW w:w="2400" w:type="dxa"/>
             <w:shd w:val="clear" w:color="auto" w:fill="C00000"/>
             <w:tcMar>
-              <w:top w:w="40" w:type="dxa"/>
-              <w:left w:w="80" w:type="dxa"/>
-              <w:bottom w:w="40" w:type="dxa"/>
-              <w:right w:w="80" w:type="dxa"/>
-            </w:tcMar>
+              <w:top w:w="70" w:type="dxa"/>
+              <w:left w:w="110" w:type="dxa"/>
+              <w:bottom w:w="70" w:type="dxa"/>
+              <w:right w:w="110" w:type="dxa"/>
+            </w:tcMar>
+            <w:vAlign w:val="center"/>
           </w:tcPr>
           <w:p>
             <w:pPr>
@@ -547,8 +590,8 @@
                 <w:b/>
                 <w:bCs/>
                 <w:color w:val="FFFFFF"/>
-                <w:sz w:val="16"/>
-                <w:szCs w:val="16"/>
+                <w:sz w:val="17"/>
+                <w:szCs w:val="17"/>
               </w:rPr>
               <w:t xml:space="preserve">UNO R4 WiFi (elegido)</w:t>
             </w:r>
@@ -559,11 +602,12 @@
             <w:tcW w:w="2100" w:type="dxa"/>
             <w:shd w:val="clear" w:color="auto" w:fill="C00000"/>
             <w:tcMar>
-              <w:top w:w="40" w:type="dxa"/>
-              <w:left w:w="80" w:type="dxa"/>
-              <w:bottom w:w="40" w:type="dxa"/>
-              <w:right w:w="80" w:type="dxa"/>
-            </w:tcMar>
+              <w:top w:w="70" w:type="dxa"/>
+              <w:left w:w="110" w:type="dxa"/>
+              <w:bottom w:w="70" w:type="dxa"/>
+              <w:right w:w="110" w:type="dxa"/>
+            </w:tcMar>
+            <w:vAlign w:val="center"/>
           </w:tcPr>
           <w:p>
             <w:pPr>
@@ -576,8 +620,8 @@
                 <w:b/>
                 <w:bCs/>
                 <w:color w:val="FFFFFF"/>
-                <w:sz w:val="16"/>
-                <w:szCs w:val="16"/>
+                <w:sz w:val="17"/>
+                <w:szCs w:val="17"/>
               </w:rPr>
               <w:t xml:space="preserve">ESP32 DevKit</w:t>
             </w:r>
@@ -588,11 +632,12 @@
             <w:tcW w:w="2000" w:type="dxa"/>
             <w:shd w:val="clear" w:color="auto" w:fill="C00000"/>
             <w:tcMar>
-              <w:top w:w="40" w:type="dxa"/>
-              <w:left w:w="80" w:type="dxa"/>
-              <w:bottom w:w="40" w:type="dxa"/>
-              <w:right w:w="80" w:type="dxa"/>
-            </w:tcMar>
+              <w:top w:w="70" w:type="dxa"/>
+              <w:left w:w="110" w:type="dxa"/>
+              <w:bottom w:w="70" w:type="dxa"/>
+              <w:right w:w="110" w:type="dxa"/>
+            </w:tcMar>
+            <w:vAlign w:val="center"/>
           </w:tcPr>
           <w:p>
             <w:pPr>
@@ -605,8 +650,8 @@
                 <w:b/>
                 <w:bCs/>
                 <w:color w:val="FFFFFF"/>
-                <w:sz w:val="16"/>
-                <w:szCs w:val="16"/>
+                <w:sz w:val="17"/>
+                <w:szCs w:val="17"/>
               </w:rPr>
               <w:t xml:space="preserve">Pico W</w:t>
             </w:r>
@@ -617,11 +662,12 @@
             <w:tcW w:w="1800" w:type="dxa"/>
             <w:shd w:val="clear" w:color="auto" w:fill="C00000"/>
             <w:tcMar>
-              <w:top w:w="40" w:type="dxa"/>
-              <w:left w:w="80" w:type="dxa"/>
-              <w:bottom w:w="40" w:type="dxa"/>
-              <w:right w:w="80" w:type="dxa"/>
-            </w:tcMar>
+              <w:top w:w="70" w:type="dxa"/>
+              <w:left w:w="110" w:type="dxa"/>
+              <w:bottom w:w="70" w:type="dxa"/>
+              <w:right w:w="110" w:type="dxa"/>
+            </w:tcMar>
+            <w:vAlign w:val="center"/>
           </w:tcPr>
           <w:p>
             <w:pPr>
@@ -634,8 +680,8 @@
                 <w:b/>
                 <w:bCs/>
                 <w:color w:val="FFFFFF"/>
-                <w:sz w:val="16"/>
-                <w:szCs w:val="16"/>
+                <w:sz w:val="17"/>
+                <w:szCs w:val="17"/>
               </w:rPr>
               <w:t xml:space="preserve">UNO R3 + ESP-01</w:t>
             </w:r>
@@ -650,11 +696,12 @@
           <w:tcPr>
             <w:tcW w:w="2200" w:type="dxa"/>
             <w:tcMar>
-              <w:top w:w="40" w:type="dxa"/>
-              <w:left w:w="80" w:type="dxa"/>
-              <w:bottom w:w="40" w:type="dxa"/>
-              <w:right w:w="80" w:type="dxa"/>
-            </w:tcMar>
+              <w:top w:w="70" w:type="dxa"/>
+              <w:left w:w="110" w:type="dxa"/>
+              <w:bottom w:w="70" w:type="dxa"/>
+              <w:right w:w="110" w:type="dxa"/>
+            </w:tcMar>
+            <w:vAlign w:val="center"/>
           </w:tcPr>
           <w:p>
             <w:pPr>
@@ -664,10 +711,10 @@
             <w:r>
               <w:rPr>
                 <w:rFonts w:ascii="Arial" w:hAnsi="Arial" w:cs="Arial"/>
-                <w:sz w:val="16"/>
-                <w:szCs w:val="16"/>
-              </w:rPr>
-              <w:t xml:space="preserve">CPU / RAM</w:t>
+                <w:sz w:val="17"/>
+                <w:szCs w:val="17"/>
+              </w:rPr>
+              <w:t xml:space="preserve">Procesador / RAM</w:t>
             </w:r>
           </w:p>
         </w:tc>
@@ -675,11 +722,12 @@
           <w:tcPr>
             <w:tcW w:w="2400" w:type="dxa"/>
             <w:tcMar>
-              <w:top w:w="40" w:type="dxa"/>
-              <w:left w:w="80" w:type="dxa"/>
-              <w:bottom w:w="40" w:type="dxa"/>
-              <w:right w:w="80" w:type="dxa"/>
-            </w:tcMar>
+              <w:top w:w="70" w:type="dxa"/>
+              <w:left w:w="110" w:type="dxa"/>
+              <w:bottom w:w="70" w:type="dxa"/>
+              <w:right w:w="110" w:type="dxa"/>
+            </w:tcMar>
+            <w:vAlign w:val="center"/>
           </w:tcPr>
           <w:p>
             <w:pPr>
@@ -689,10 +737,10 @@
             <w:r>
               <w:rPr>
                 <w:rFonts w:ascii="Arial" w:hAnsi="Arial" w:cs="Arial"/>
-                <w:sz w:val="16"/>
-                <w:szCs w:val="16"/>
-              </w:rPr>
-              <w:t xml:space="preserve">Cortex-M4 48 MHz / 32 KB</w:t>
+                <w:sz w:val="17"/>
+                <w:szCs w:val="17"/>
+              </w:rPr>
+              <w:t xml:space="preserve">48 MHz / 32 KB</w:t>
             </w:r>
           </w:p>
         </w:tc>
@@ -700,11 +748,12 @@
           <w:tcPr>
             <w:tcW w:w="2100" w:type="dxa"/>
             <w:tcMar>
-              <w:top w:w="40" w:type="dxa"/>
-              <w:left w:w="80" w:type="dxa"/>
-              <w:bottom w:w="40" w:type="dxa"/>
-              <w:right w:w="80" w:type="dxa"/>
-            </w:tcMar>
+              <w:top w:w="70" w:type="dxa"/>
+              <w:left w:w="110" w:type="dxa"/>
+              <w:bottom w:w="70" w:type="dxa"/>
+              <w:right w:w="110" w:type="dxa"/>
+            </w:tcMar>
+            <w:vAlign w:val="center"/>
           </w:tcPr>
           <w:p>
             <w:pPr>
@@ -714,8 +763,8 @@
             <w:r>
               <w:rPr>
                 <w:rFonts w:ascii="Arial" w:hAnsi="Arial" w:cs="Arial"/>
-                <w:sz w:val="16"/>
-                <w:szCs w:val="16"/>
+                <w:sz w:val="17"/>
+                <w:szCs w:val="17"/>
               </w:rPr>
               <w:t xml:space="preserve">240 MHz / 520 KB</w:t>
             </w:r>
@@ -725,11 +774,12 @@
           <w:tcPr>
             <w:tcW w:w="2000" w:type="dxa"/>
             <w:tcMar>
-              <w:top w:w="40" w:type="dxa"/>
-              <w:left w:w="80" w:type="dxa"/>
-              <w:bottom w:w="40" w:type="dxa"/>
-              <w:right w:w="80" w:type="dxa"/>
-            </w:tcMar>
+              <w:top w:w="70" w:type="dxa"/>
+              <w:left w:w="110" w:type="dxa"/>
+              <w:bottom w:w="70" w:type="dxa"/>
+              <w:right w:w="110" w:type="dxa"/>
+            </w:tcMar>
+            <w:vAlign w:val="center"/>
           </w:tcPr>
           <w:p>
             <w:pPr>
@@ -739,8 +789,8 @@
             <w:r>
               <w:rPr>
                 <w:rFonts w:ascii="Arial" w:hAnsi="Arial" w:cs="Arial"/>
-                <w:sz w:val="16"/>
-                <w:szCs w:val="16"/>
+                <w:sz w:val="17"/>
+                <w:szCs w:val="17"/>
               </w:rPr>
               <w:t xml:space="preserve">133 MHz / 264 KB</w:t>
             </w:r>
@@ -750,11 +800,12 @@
           <w:tcPr>
             <w:tcW w:w="1800" w:type="dxa"/>
             <w:tcMar>
-              <w:top w:w="40" w:type="dxa"/>
-              <w:left w:w="80" w:type="dxa"/>
-              <w:bottom w:w="40" w:type="dxa"/>
-              <w:right w:w="80" w:type="dxa"/>
-            </w:tcMar>
+              <w:top w:w="70" w:type="dxa"/>
+              <w:left w:w="110" w:type="dxa"/>
+              <w:bottom w:w="70" w:type="dxa"/>
+              <w:right w:w="110" w:type="dxa"/>
+            </w:tcMar>
+            <w:vAlign w:val="center"/>
           </w:tcPr>
           <w:p>
             <w:pPr>
@@ -764,8 +815,8 @@
             <w:r>
               <w:rPr>
                 <w:rFonts w:ascii="Arial" w:hAnsi="Arial" w:cs="Arial"/>
-                <w:sz w:val="16"/>
-                <w:szCs w:val="16"/>
+                <w:sz w:val="17"/>
+                <w:szCs w:val="17"/>
               </w:rPr>
               <w:t xml:space="preserve">16 MHz / 2 KB</w:t>
             </w:r>
@@ -780,11 +831,12 @@
           <w:tcPr>
             <w:tcW w:w="2200" w:type="dxa"/>
             <w:tcMar>
-              <w:top w:w="40" w:type="dxa"/>
-              <w:left w:w="80" w:type="dxa"/>
-              <w:bottom w:w="40" w:type="dxa"/>
-              <w:right w:w="80" w:type="dxa"/>
-            </w:tcMar>
+              <w:top w:w="70" w:type="dxa"/>
+              <w:left w:w="110" w:type="dxa"/>
+              <w:bottom w:w="70" w:type="dxa"/>
+              <w:right w:w="110" w:type="dxa"/>
+            </w:tcMar>
+            <w:vAlign w:val="center"/>
           </w:tcPr>
           <w:p>
             <w:pPr>
@@ -794,10 +846,10 @@
             <w:r>
               <w:rPr>
                 <w:rFonts w:ascii="Arial" w:hAnsi="Arial" w:cs="Arial"/>
-                <w:sz w:val="16"/>
-                <w:szCs w:val="16"/>
-              </w:rPr>
-              <w:t xml:space="preserve">WiFi + TLS</w:t>
+                <w:sz w:val="17"/>
+                <w:szCs w:val="17"/>
+              </w:rPr>
+              <w:t xml:space="preserve">WiFi con HTTPS</w:t>
             </w:r>
           </w:p>
         </w:tc>
@@ -805,11 +857,12 @@
           <w:tcPr>
             <w:tcW w:w="2400" w:type="dxa"/>
             <w:tcMar>
-              <w:top w:w="40" w:type="dxa"/>
-              <w:left w:w="80" w:type="dxa"/>
-              <w:bottom w:w="40" w:type="dxa"/>
-              <w:right w:w="80" w:type="dxa"/>
-            </w:tcMar>
+              <w:top w:w="70" w:type="dxa"/>
+              <w:left w:w="110" w:type="dxa"/>
+              <w:bottom w:w="70" w:type="dxa"/>
+              <w:right w:w="110" w:type="dxa"/>
+            </w:tcMar>
+            <w:vAlign w:val="center"/>
           </w:tcPr>
           <w:p>
             <w:pPr>
@@ -819,10 +872,10 @@
             <w:r>
               <w:rPr>
                 <w:rFonts w:ascii="Arial" w:hAnsi="Arial" w:cs="Arial"/>
-                <w:sz w:val="16"/>
-                <w:szCs w:val="16"/>
-              </w:rPr>
-              <w:t xml:space="preserve">Sí (ESP32-S3)</w:t>
+                <w:sz w:val="17"/>
+                <w:szCs w:val="17"/>
+              </w:rPr>
+              <w:t xml:space="preserve">Sí</w:t>
             </w:r>
           </w:p>
         </w:tc>
@@ -830,11 +883,12 @@
           <w:tcPr>
             <w:tcW w:w="2100" w:type="dxa"/>
             <w:tcMar>
-              <w:top w:w="40" w:type="dxa"/>
-              <w:left w:w="80" w:type="dxa"/>
-              <w:bottom w:w="40" w:type="dxa"/>
-              <w:right w:w="80" w:type="dxa"/>
-            </w:tcMar>
+              <w:top w:w="70" w:type="dxa"/>
+              <w:left w:w="110" w:type="dxa"/>
+              <w:bottom w:w="70" w:type="dxa"/>
+              <w:right w:w="110" w:type="dxa"/>
+            </w:tcMar>
+            <w:vAlign w:val="center"/>
           </w:tcPr>
           <w:p>
             <w:pPr>
@@ -844,8 +898,8 @@
             <w:r>
               <w:rPr>
                 <w:rFonts w:ascii="Arial" w:hAnsi="Arial" w:cs="Arial"/>
-                <w:sz w:val="16"/>
-                <w:szCs w:val="16"/>
+                <w:sz w:val="17"/>
+                <w:szCs w:val="17"/>
               </w:rPr>
               <w:t xml:space="preserve">Sí</w:t>
             </w:r>
@@ -855,11 +909,12 @@
           <w:tcPr>
             <w:tcW w:w="2000" w:type="dxa"/>
             <w:tcMar>
-              <w:top w:w="40" w:type="dxa"/>
-              <w:left w:w="80" w:type="dxa"/>
-              <w:bottom w:w="40" w:type="dxa"/>
-              <w:right w:w="80" w:type="dxa"/>
-            </w:tcMar>
+              <w:top w:w="70" w:type="dxa"/>
+              <w:left w:w="110" w:type="dxa"/>
+              <w:bottom w:w="70" w:type="dxa"/>
+              <w:right w:w="110" w:type="dxa"/>
+            </w:tcMar>
+            <w:vAlign w:val="center"/>
           </w:tcPr>
           <w:p>
             <w:pPr>
@@ -869,8 +924,8 @@
             <w:r>
               <w:rPr>
                 <w:rFonts w:ascii="Arial" w:hAnsi="Arial" w:cs="Arial"/>
-                <w:sz w:val="16"/>
-                <w:szCs w:val="16"/>
+                <w:sz w:val="17"/>
+                <w:szCs w:val="17"/>
               </w:rPr>
               <w:t xml:space="preserve">Sí</w:t>
             </w:r>
@@ -880,11 +935,12 @@
           <w:tcPr>
             <w:tcW w:w="1800" w:type="dxa"/>
             <w:tcMar>
-              <w:top w:w="40" w:type="dxa"/>
-              <w:left w:w="80" w:type="dxa"/>
-              <w:bottom w:w="40" w:type="dxa"/>
-              <w:right w:w="80" w:type="dxa"/>
-            </w:tcMar>
+              <w:top w:w="70" w:type="dxa"/>
+              <w:left w:w="110" w:type="dxa"/>
+              <w:bottom w:w="70" w:type="dxa"/>
+              <w:right w:w="110" w:type="dxa"/>
+            </w:tcMar>
+            <w:vAlign w:val="center"/>
           </w:tcPr>
           <w:p>
             <w:pPr>
@@ -894,8 +950,8 @@
             <w:r>
               <w:rPr>
                 <w:rFonts w:ascii="Arial" w:hAnsi="Arial" w:cs="Arial"/>
-                <w:sz w:val="16"/>
-                <w:szCs w:val="16"/>
+                <w:sz w:val="17"/>
+                <w:szCs w:val="17"/>
               </w:rPr>
               <w:t xml:space="preserve">Muy limitado</w:t>
             </w:r>
@@ -910,11 +966,12 @@
           <w:tcPr>
             <w:tcW w:w="2200" w:type="dxa"/>
             <w:tcMar>
-              <w:top w:w="40" w:type="dxa"/>
-              <w:left w:w="80" w:type="dxa"/>
-              <w:bottom w:w="40" w:type="dxa"/>
-              <w:right w:w="80" w:type="dxa"/>
-            </w:tcMar>
+              <w:top w:w="70" w:type="dxa"/>
+              <w:left w:w="110" w:type="dxa"/>
+              <w:bottom w:w="70" w:type="dxa"/>
+              <w:right w:w="110" w:type="dxa"/>
+            </w:tcMar>
+            <w:vAlign w:val="center"/>
           </w:tcPr>
           <w:p>
             <w:pPr>
@@ -924,10 +981,10 @@
             <w:r>
               <w:rPr>
                 <w:rFonts w:ascii="Arial" w:hAnsi="Arial" w:cs="Arial"/>
-                <w:sz w:val="16"/>
-                <w:szCs w:val="16"/>
-              </w:rPr>
-              <w:t xml:space="preserve">Nivel lógico</w:t>
+                <w:sz w:val="17"/>
+                <w:szCs w:val="17"/>
+              </w:rPr>
+              <w:t xml:space="preserve">Voltaje de trabajo</w:t>
             </w:r>
           </w:p>
         </w:tc>
@@ -935,11 +992,12 @@
           <w:tcPr>
             <w:tcW w:w="2400" w:type="dxa"/>
             <w:tcMar>
-              <w:top w:w="40" w:type="dxa"/>
-              <w:left w:w="80" w:type="dxa"/>
-              <w:bottom w:w="40" w:type="dxa"/>
-              <w:right w:w="80" w:type="dxa"/>
-            </w:tcMar>
+              <w:top w:w="70" w:type="dxa"/>
+              <w:left w:w="110" w:type="dxa"/>
+              <w:bottom w:w="70" w:type="dxa"/>
+              <w:right w:w="110" w:type="dxa"/>
+            </w:tcMar>
+            <w:vAlign w:val="center"/>
           </w:tcPr>
           <w:p>
             <w:pPr>
@@ -949,10 +1007,10 @@
             <w:r>
               <w:rPr>
                 <w:rFonts w:ascii="Arial" w:hAnsi="Arial" w:cs="Arial"/>
-                <w:sz w:val="16"/>
-                <w:szCs w:val="16"/>
-              </w:rPr>
-              <w:t xml:space="preserve">5 V (directo con HC-SR04)</w:t>
+                <w:sz w:val="17"/>
+                <w:szCs w:val="17"/>
+              </w:rPr>
+              <w:t xml:space="preserve">5 V</w:t>
             </w:r>
           </w:p>
         </w:tc>
@@ -960,11 +1018,12 @@
           <w:tcPr>
             <w:tcW w:w="2100" w:type="dxa"/>
             <w:tcMar>
-              <w:top w:w="40" w:type="dxa"/>
-              <w:left w:w="80" w:type="dxa"/>
-              <w:bottom w:w="40" w:type="dxa"/>
-              <w:right w:w="80" w:type="dxa"/>
-            </w:tcMar>
+              <w:top w:w="70" w:type="dxa"/>
+              <w:left w:w="110" w:type="dxa"/>
+              <w:bottom w:w="70" w:type="dxa"/>
+              <w:right w:w="110" w:type="dxa"/>
+            </w:tcMar>
+            <w:vAlign w:val="center"/>
           </w:tcPr>
           <w:p>
             <w:pPr>
@@ -974,10 +1033,10 @@
             <w:r>
               <w:rPr>
                 <w:rFonts w:ascii="Arial" w:hAnsi="Arial" w:cs="Arial"/>
-                <w:sz w:val="16"/>
-                <w:szCs w:val="16"/>
-              </w:rPr>
-              <w:t xml:space="preserve">3,3 V (requiere divisor)</w:t>
+                <w:sz w:val="17"/>
+                <w:szCs w:val="17"/>
+              </w:rPr>
+              <w:t xml:space="preserve">3,3 V</w:t>
             </w:r>
           </w:p>
         </w:tc>
@@ -985,11 +1044,12 @@
           <w:tcPr>
             <w:tcW w:w="2000" w:type="dxa"/>
             <w:tcMar>
-              <w:top w:w="40" w:type="dxa"/>
-              <w:left w:w="80" w:type="dxa"/>
-              <w:bottom w:w="40" w:type="dxa"/>
-              <w:right w:w="80" w:type="dxa"/>
-            </w:tcMar>
+              <w:top w:w="70" w:type="dxa"/>
+              <w:left w:w="110" w:type="dxa"/>
+              <w:bottom w:w="70" w:type="dxa"/>
+              <w:right w:w="110" w:type="dxa"/>
+            </w:tcMar>
+            <w:vAlign w:val="center"/>
           </w:tcPr>
           <w:p>
             <w:pPr>
@@ -999,10 +1059,10 @@
             <w:r>
               <w:rPr>
                 <w:rFonts w:ascii="Arial" w:hAnsi="Arial" w:cs="Arial"/>
-                <w:sz w:val="16"/>
-                <w:szCs w:val="16"/>
-              </w:rPr>
-              <w:t xml:space="preserve">3,3 V (requiere divisor)</w:t>
+                <w:sz w:val="17"/>
+                <w:szCs w:val="17"/>
+              </w:rPr>
+              <w:t xml:space="preserve">3,3 V</w:t>
             </w:r>
           </w:p>
         </w:tc>
@@ -1010,11 +1070,12 @@
           <w:tcPr>
             <w:tcW w:w="1800" w:type="dxa"/>
             <w:tcMar>
-              <w:top w:w="40" w:type="dxa"/>
-              <w:left w:w="80" w:type="dxa"/>
-              <w:bottom w:w="40" w:type="dxa"/>
-              <w:right w:w="80" w:type="dxa"/>
-            </w:tcMar>
+              <w:top w:w="70" w:type="dxa"/>
+              <w:left w:w="110" w:type="dxa"/>
+              <w:bottom w:w="70" w:type="dxa"/>
+              <w:right w:w="110" w:type="dxa"/>
+            </w:tcMar>
+            <w:vAlign w:val="center"/>
           </w:tcPr>
           <w:p>
             <w:pPr>
@@ -1024,8 +1085,8 @@
             <w:r>
               <w:rPr>
                 <w:rFonts w:ascii="Arial" w:hAnsi="Arial" w:cs="Arial"/>
-                <w:sz w:val="16"/>
-                <w:szCs w:val="16"/>
+                <w:sz w:val="17"/>
+                <w:szCs w:val="17"/>
               </w:rPr>
               <w:t xml:space="preserve">5 V</w:t>
             </w:r>
@@ -1040,11 +1101,12 @@
           <w:tcPr>
             <w:tcW w:w="2200" w:type="dxa"/>
             <w:tcMar>
-              <w:top w:w="40" w:type="dxa"/>
-              <w:left w:w="80" w:type="dxa"/>
-              <w:bottom w:w="40" w:type="dxa"/>
-              <w:right w:w="80" w:type="dxa"/>
-            </w:tcMar>
+              <w:top w:w="70" w:type="dxa"/>
+              <w:left w:w="110" w:type="dxa"/>
+              <w:bottom w:w="70" w:type="dxa"/>
+              <w:right w:w="110" w:type="dxa"/>
+            </w:tcMar>
+            <w:vAlign w:val="center"/>
           </w:tcPr>
           <w:p>
             <w:pPr>
@@ -1054,10 +1116,10 @@
             <w:r>
               <w:rPr>
                 <w:rFonts w:ascii="Arial" w:hAnsi="Arial" w:cs="Arial"/>
-                <w:sz w:val="16"/>
-                <w:szCs w:val="16"/>
-              </w:rPr>
-              <w:t xml:space="preserve">Precio ref. (CLP)</w:t>
+                <w:sz w:val="17"/>
+                <w:szCs w:val="17"/>
+              </w:rPr>
+              <w:t xml:space="preserve">Precio aprox. (CLP)</w:t>
             </w:r>
           </w:p>
         </w:tc>
@@ -1065,11 +1127,12 @@
           <w:tcPr>
             <w:tcW w:w="2400" w:type="dxa"/>
             <w:tcMar>
-              <w:top w:w="40" w:type="dxa"/>
-              <w:left w:w="80" w:type="dxa"/>
-              <w:bottom w:w="40" w:type="dxa"/>
-              <w:right w:w="80" w:type="dxa"/>
-            </w:tcMar>
+              <w:top w:w="70" w:type="dxa"/>
+              <w:left w:w="110" w:type="dxa"/>
+              <w:bottom w:w="70" w:type="dxa"/>
+              <w:right w:w="110" w:type="dxa"/>
+            </w:tcMar>
+            <w:vAlign w:val="center"/>
           </w:tcPr>
           <w:p>
             <w:pPr>
@@ -1079,10 +1142,10 @@
             <w:r>
               <w:rPr>
                 <w:rFonts w:ascii="Arial" w:hAnsi="Arial" w:cs="Arial"/>
-                <w:sz w:val="16"/>
-                <w:szCs w:val="16"/>
-              </w:rPr>
-              <w:t xml:space="preserve">≈ $32.000</w:t>
+                <w:sz w:val="17"/>
+                <w:szCs w:val="17"/>
+              </w:rPr>
+              <w:t xml:space="preserve">$32.000</w:t>
             </w:r>
           </w:p>
         </w:tc>
@@ -1090,11 +1153,12 @@
           <w:tcPr>
             <w:tcW w:w="2100" w:type="dxa"/>
             <w:tcMar>
-              <w:top w:w="40" w:type="dxa"/>
-              <w:left w:w="80" w:type="dxa"/>
-              <w:bottom w:w="40" w:type="dxa"/>
-              <w:right w:w="80" w:type="dxa"/>
-            </w:tcMar>
+              <w:top w:w="70" w:type="dxa"/>
+              <w:left w:w="110" w:type="dxa"/>
+              <w:bottom w:w="70" w:type="dxa"/>
+              <w:right w:w="110" w:type="dxa"/>
+            </w:tcMar>
+            <w:vAlign w:val="center"/>
           </w:tcPr>
           <w:p>
             <w:pPr>
@@ -1104,10 +1168,10 @@
             <w:r>
               <w:rPr>
                 <w:rFonts w:ascii="Arial" w:hAnsi="Arial" w:cs="Arial"/>
-                <w:sz w:val="16"/>
-                <w:szCs w:val="16"/>
-              </w:rPr>
-              <w:t xml:space="preserve">≈ $7.000</w:t>
+                <w:sz w:val="17"/>
+                <w:szCs w:val="17"/>
+              </w:rPr>
+              <w:t xml:space="preserve">$7.000</w:t>
             </w:r>
           </w:p>
         </w:tc>
@@ -1115,11 +1179,12 @@
           <w:tcPr>
             <w:tcW w:w="2000" w:type="dxa"/>
             <w:tcMar>
-              <w:top w:w="40" w:type="dxa"/>
-              <w:left w:w="80" w:type="dxa"/>
-              <w:bottom w:w="40" w:type="dxa"/>
-              <w:right w:w="80" w:type="dxa"/>
-            </w:tcMar>
+              <w:top w:w="70" w:type="dxa"/>
+              <w:left w:w="110" w:type="dxa"/>
+              <w:bottom w:w="70" w:type="dxa"/>
+              <w:right w:w="110" w:type="dxa"/>
+            </w:tcMar>
+            <w:vAlign w:val="center"/>
           </w:tcPr>
           <w:p>
             <w:pPr>
@@ -1129,10 +1194,10 @@
             <w:r>
               <w:rPr>
                 <w:rFonts w:ascii="Arial" w:hAnsi="Arial" w:cs="Arial"/>
-                <w:sz w:val="16"/>
-                <w:szCs w:val="16"/>
-              </w:rPr>
-              <w:t xml:space="preserve">≈ $9.000</w:t>
+                <w:sz w:val="17"/>
+                <w:szCs w:val="17"/>
+              </w:rPr>
+              <w:t xml:space="preserve">$9.000</w:t>
             </w:r>
           </w:p>
         </w:tc>
@@ -1140,11 +1205,12 @@
           <w:tcPr>
             <w:tcW w:w="1800" w:type="dxa"/>
             <w:tcMar>
-              <w:top w:w="40" w:type="dxa"/>
-              <w:left w:w="80" w:type="dxa"/>
-              <w:bottom w:w="40" w:type="dxa"/>
-              <w:right w:w="80" w:type="dxa"/>
-            </w:tcMar>
+              <w:top w:w="70" w:type="dxa"/>
+              <w:left w:w="110" w:type="dxa"/>
+              <w:bottom w:w="70" w:type="dxa"/>
+              <w:right w:w="110" w:type="dxa"/>
+            </w:tcMar>
+            <w:vAlign w:val="center"/>
           </w:tcPr>
           <w:p>
             <w:pPr>
@@ -1154,10 +1220,10 @@
             <w:r>
               <w:rPr>
                 <w:rFonts w:ascii="Arial" w:hAnsi="Arial" w:cs="Arial"/>
-                <w:sz w:val="16"/>
-                <w:szCs w:val="16"/>
-              </w:rPr>
-              <w:t xml:space="preserve">≈ $18.000</w:t>
+                <w:sz w:val="17"/>
+                <w:szCs w:val="17"/>
+              </w:rPr>
+              <w:t xml:space="preserve">$18.000</w:t>
             </w:r>
           </w:p>
         </w:tc>
@@ -1165,13 +1231,45 @@
     </w:tbl>
     <w:p>
       <w:pPr>
-        <w:spacing w:after="60"/>
+        <w:spacing w:after="120"/>
       </w:pPr>
     </w:p>
     <w:p>
       <w:pPr>
         <w:keepNext/>
-        <w:spacing w:before="60" w:after="160"/>
+        <w:spacing w:before="160" w:after="100"/>
+        <w:jc w:val="left"/>
+      </w:pPr>
+      <w:r>
+        <w:rPr>
+          <w:rFonts w:ascii="Arial" w:hAnsi="Arial" w:cs="Arial"/>
+          <w:b/>
+          <w:bCs/>
+          <w:color w:val="404040"/>
+          <w:sz w:val="22"/>
+          <w:szCs w:val="22"/>
+        </w:rPr>
+        <w:t xml:space="preserve">Sensores y actuadores</w:t>
+      </w:r>
+    </w:p>
+    <w:p>
+      <w:pPr>
+        <w:spacing w:after="200" w:line="276" w:lineRule="auto"/>
+        <w:jc w:val="both"/>
+      </w:pPr>
+      <w:r>
+        <w:rPr>
+          <w:rFonts w:ascii="Arial" w:hAnsi="Arial" w:cs="Arial"/>
+          <w:sz w:val="22"/>
+          <w:szCs w:val="22"/>
+        </w:rPr>
+        <w:t xml:space="preserve">Se integraron tres sensores que se complementan entre sí, todos alimentados a 5 V y con tierra común. Como actuadores se usaron la señal de disparo del sensor ultrasónico y las salidas remotas del sistema: la alarma sonora en la aplicación, el SMS, la notificación push y la foto automática (Tabla 2).</w:t>
+      </w:r>
+    </w:p>
+    <w:p>
+      <w:pPr>
+        <w:keepNext/>
+        <w:spacing w:before="100" w:after="280"/>
         <w:jc w:val="center"/>
       </w:pPr>
       <w:r>
@@ -1194,7 +1292,7 @@
           <w:sz w:val="18"/>
           <w:szCs w:val="18"/>
         </w:rPr>
-        <w:t xml:space="preserve">Sensores y actuadores integrados (todos alimentados a 5 V con GND común).</w:t>
+        <w:t xml:space="preserve">Sensores y actuadores del sistema.</w:t>
       </w:r>
     </w:p>
     <w:tbl>
@@ -1212,9 +1310,9 @@
         <w:tblLayout w:type="fixed"/>
       </w:tblPr>
       <w:tblGrid>
-        <w:gridCol w:w="2600"/>
-        <w:gridCol w:w="2400"/>
-        <w:gridCol w:w="5500"/>
+        <w:gridCol w:w="3000"/>
+        <w:gridCol w:w="3000"/>
+        <w:gridCol w:w="4500"/>
       </w:tblGrid>
       <w:tr>
         <w:trPr>
@@ -1223,14 +1321,15 @@
         </w:trPr>
         <w:tc>
           <w:tcPr>
-            <w:tcW w:w="2600" w:type="dxa"/>
+            <w:tcW w:w="3000" w:type="dxa"/>
             <w:shd w:val="clear" w:color="auto" w:fill="C00000"/>
             <w:tcMar>
-              <w:top w:w="40" w:type="dxa"/>
-              <w:left w:w="80" w:type="dxa"/>
-              <w:bottom w:w="40" w:type="dxa"/>
-              <w:right w:w="80" w:type="dxa"/>
-            </w:tcMar>
+              <w:top w:w="70" w:type="dxa"/>
+              <w:left w:w="110" w:type="dxa"/>
+              <w:bottom w:w="70" w:type="dxa"/>
+              <w:right w:w="110" w:type="dxa"/>
+            </w:tcMar>
+            <w:vAlign w:val="center"/>
           </w:tcPr>
           <w:p>
             <w:pPr>
@@ -1243,8 +1342,8 @@
                 <w:b/>
                 <w:bCs/>
                 <w:color w:val="FFFFFF"/>
-                <w:sz w:val="16"/>
-                <w:szCs w:val="16"/>
+                <w:sz w:val="17"/>
+                <w:szCs w:val="17"/>
               </w:rPr>
               <w:t xml:space="preserve">Componente</w:t>
             </w:r>
@@ -1252,14 +1351,15 @@
         </w:tc>
         <w:tc>
           <w:tcPr>
-            <w:tcW w:w="2400" w:type="dxa"/>
+            <w:tcW w:w="3000" w:type="dxa"/>
             <w:shd w:val="clear" w:color="auto" w:fill="C00000"/>
             <w:tcMar>
-              <w:top w:w="40" w:type="dxa"/>
-              <w:left w:w="80" w:type="dxa"/>
-              <w:bottom w:w="40" w:type="dxa"/>
-              <w:right w:w="80" w:type="dxa"/>
-            </w:tcMar>
+              <w:top w:w="70" w:type="dxa"/>
+              <w:left w:w="110" w:type="dxa"/>
+              <w:bottom w:w="70" w:type="dxa"/>
+              <w:right w:w="110" w:type="dxa"/>
+            </w:tcMar>
+            <w:vAlign w:val="center"/>
           </w:tcPr>
           <w:p>
             <w:pPr>
@@ -1272,23 +1372,24 @@
                 <w:b/>
                 <w:bCs/>
                 <w:color w:val="FFFFFF"/>
-                <w:sz w:val="16"/>
-                <w:szCs w:val="16"/>
-              </w:rPr>
-              <w:t xml:space="preserve">Pines</w:t>
-            </w:r>
-          </w:p>
-        </w:tc>
-        <w:tc>
-          <w:tcPr>
-            <w:tcW w:w="5500" w:type="dxa"/>
+                <w:sz w:val="17"/>
+                <w:szCs w:val="17"/>
+              </w:rPr>
+              <w:t xml:space="preserve">Conexión</w:t>
+            </w:r>
+          </w:p>
+        </w:tc>
+        <w:tc>
+          <w:tcPr>
+            <w:tcW w:w="4500" w:type="dxa"/>
             <w:shd w:val="clear" w:color="auto" w:fill="C00000"/>
             <w:tcMar>
-              <w:top w:w="40" w:type="dxa"/>
-              <w:left w:w="80" w:type="dxa"/>
-              <w:bottom w:w="40" w:type="dxa"/>
-              <w:right w:w="80" w:type="dxa"/>
-            </w:tcMar>
+              <w:top w:w="70" w:type="dxa"/>
+              <w:left w:w="110" w:type="dxa"/>
+              <w:bottom w:w="70" w:type="dxa"/>
+              <w:right w:w="110" w:type="dxa"/>
+            </w:tcMar>
+            <w:vAlign w:val="center"/>
           </w:tcPr>
           <w:p>
             <w:pPr>
@@ -1301,10 +1402,10 @@
                 <w:b/>
                 <w:bCs/>
                 <w:color w:val="FFFFFF"/>
-                <w:sz w:val="16"/>
-                <w:szCs w:val="16"/>
-              </w:rPr>
-              <w:t xml:space="preserve">Función y configuración</w:t>
+                <w:sz w:val="17"/>
+                <w:szCs w:val="17"/>
+              </w:rPr>
+              <w:t xml:space="preserve">Función</w:t>
             </w:r>
           </w:p>
         </w:tc>
@@ -1315,13 +1416,14 @@
         </w:trPr>
         <w:tc>
           <w:tcPr>
-            <w:tcW w:w="2600" w:type="dxa"/>
-            <w:tcMar>
-              <w:top w:w="40" w:type="dxa"/>
-              <w:left w:w="80" w:type="dxa"/>
-              <w:bottom w:w="40" w:type="dxa"/>
-              <w:right w:w="80" w:type="dxa"/>
-            </w:tcMar>
+            <w:tcW w:w="3000" w:type="dxa"/>
+            <w:tcMar>
+              <w:top w:w="70" w:type="dxa"/>
+              <w:left w:w="110" w:type="dxa"/>
+              <w:bottom w:w="70" w:type="dxa"/>
+              <w:right w:w="110" w:type="dxa"/>
+            </w:tcMar>
+            <w:vAlign w:val="center"/>
           </w:tcPr>
           <w:p>
             <w:pPr>
@@ -1331,8 +1433,8 @@
             <w:r>
               <w:rPr>
                 <w:rFonts w:ascii="Arial" w:hAnsi="Arial" w:cs="Arial"/>
-                <w:sz w:val="16"/>
-                <w:szCs w:val="16"/>
+                <w:sz w:val="17"/>
+                <w:szCs w:val="17"/>
               </w:rPr>
               <w:t xml:space="preserve">Sensor de sonido HW-485</w:t>
             </w:r>
@@ -1340,13 +1442,14 @@
         </w:tc>
         <w:tc>
           <w:tcPr>
-            <w:tcW w:w="2400" w:type="dxa"/>
-            <w:tcMar>
-              <w:top w:w="40" w:type="dxa"/>
-              <w:left w:w="80" w:type="dxa"/>
-              <w:bottom w:w="40" w:type="dxa"/>
-              <w:right w:w="80" w:type="dxa"/>
-            </w:tcMar>
+            <w:tcW w:w="3000" w:type="dxa"/>
+            <w:tcMar>
+              <w:top w:w="70" w:type="dxa"/>
+              <w:left w:w="110" w:type="dxa"/>
+              <w:bottom w:w="70" w:type="dxa"/>
+              <w:right w:w="110" w:type="dxa"/>
+            </w:tcMar>
+            <w:vAlign w:val="center"/>
           </w:tcPr>
           <w:p>
             <w:pPr>
@@ -1356,22 +1459,23 @@
             <w:r>
               <w:rPr>
                 <w:rFonts w:ascii="Arial" w:hAnsi="Arial" w:cs="Arial"/>
-                <w:sz w:val="16"/>
-                <w:szCs w:val="16"/>
-              </w:rPr>
-              <w:t xml:space="preserve">AO → A0, DO → D2</w:t>
-            </w:r>
-          </w:p>
-        </w:tc>
-        <w:tc>
-          <w:tcPr>
-            <w:tcW w:w="5500" w:type="dxa"/>
-            <w:tcMar>
-              <w:top w:w="40" w:type="dxa"/>
-              <w:left w:w="80" w:type="dxa"/>
-              <w:bottom w:w="40" w:type="dxa"/>
-              <w:right w:w="80" w:type="dxa"/>
-            </w:tcMar>
+                <w:sz w:val="17"/>
+                <w:szCs w:val="17"/>
+              </w:rPr>
+              <w:t xml:space="preserve">AO a A0 y DO a D2</w:t>
+            </w:r>
+          </w:p>
+        </w:tc>
+        <w:tc>
+          <w:tcPr>
+            <w:tcW w:w="4500" w:type="dxa"/>
+            <w:tcMar>
+              <w:top w:w="70" w:type="dxa"/>
+              <w:left w:w="110" w:type="dxa"/>
+              <w:bottom w:w="70" w:type="dxa"/>
+              <w:right w:w="110" w:type="dxa"/>
+            </w:tcMar>
+            <w:vAlign w:val="center"/>
           </w:tcPr>
           <w:p>
             <w:pPr>
@@ -1381,10 +1485,10 @@
             <w:r>
               <w:rPr>
                 <w:rFonts w:ascii="Arial" w:hAnsi="Arial" w:cs="Arial"/>
-                <w:sz w:val="16"/>
-                <w:szCs w:val="16"/>
-              </w:rPr>
-              <w:t xml:space="preserve">Amplitud pico a pico en ventana de 40 ms; detecta golpes o forzamiento.</w:t>
+                <w:sz w:val="17"/>
+                <w:szCs w:val="17"/>
+              </w:rPr>
+              <w:t xml:space="preserve">Detecta golpes o ruidos fuertes.</w:t>
             </w:r>
           </w:p>
         </w:tc>
@@ -1395,13 +1499,14 @@
         </w:trPr>
         <w:tc>
           <w:tcPr>
-            <w:tcW w:w="2600" w:type="dxa"/>
-            <w:tcMar>
-              <w:top w:w="40" w:type="dxa"/>
-              <w:left w:w="80" w:type="dxa"/>
-              <w:bottom w:w="40" w:type="dxa"/>
-              <w:right w:w="80" w:type="dxa"/>
-            </w:tcMar>
+            <w:tcW w:w="3000" w:type="dxa"/>
+            <w:tcMar>
+              <w:top w:w="70" w:type="dxa"/>
+              <w:left w:w="110" w:type="dxa"/>
+              <w:bottom w:w="70" w:type="dxa"/>
+              <w:right w:w="110" w:type="dxa"/>
+            </w:tcMar>
+            <w:vAlign w:val="center"/>
           </w:tcPr>
           <w:p>
             <w:pPr>
@@ -1411,22 +1516,23 @@
             <w:r>
               <w:rPr>
                 <w:rFonts w:ascii="Arial" w:hAnsi="Arial" w:cs="Arial"/>
-                <w:sz w:val="16"/>
-                <w:szCs w:val="16"/>
-              </w:rPr>
-              <w:t xml:space="preserve">Sensor de luz HW-486 (LDR)</w:t>
-            </w:r>
-          </w:p>
-        </w:tc>
-        <w:tc>
-          <w:tcPr>
-            <w:tcW w:w="2400" w:type="dxa"/>
-            <w:tcMar>
-              <w:top w:w="40" w:type="dxa"/>
-              <w:left w:w="80" w:type="dxa"/>
-              <w:bottom w:w="40" w:type="dxa"/>
-              <w:right w:w="80" w:type="dxa"/>
-            </w:tcMar>
+                <w:sz w:val="17"/>
+                <w:szCs w:val="17"/>
+              </w:rPr>
+              <w:t xml:space="preserve">Sensor de luz HW-486</w:t>
+            </w:r>
+          </w:p>
+        </w:tc>
+        <w:tc>
+          <w:tcPr>
+            <w:tcW w:w="3000" w:type="dxa"/>
+            <w:tcMar>
+              <w:top w:w="70" w:type="dxa"/>
+              <w:left w:w="110" w:type="dxa"/>
+              <w:bottom w:w="70" w:type="dxa"/>
+              <w:right w:w="110" w:type="dxa"/>
+            </w:tcMar>
+            <w:vAlign w:val="center"/>
           </w:tcPr>
           <w:p>
             <w:pPr>
@@ -1436,22 +1542,23 @@
             <w:r>
               <w:rPr>
                 <w:rFonts w:ascii="Arial" w:hAnsi="Arial" w:cs="Arial"/>
-                <w:sz w:val="16"/>
-                <w:szCs w:val="16"/>
-              </w:rPr>
-              <w:t xml:space="preserve">AO → A1</w:t>
-            </w:r>
-          </w:p>
-        </w:tc>
-        <w:tc>
-          <w:tcPr>
-            <w:tcW w:w="5500" w:type="dxa"/>
-            <w:tcMar>
-              <w:top w:w="40" w:type="dxa"/>
-              <w:left w:w="80" w:type="dxa"/>
-              <w:bottom w:w="40" w:type="dxa"/>
-              <w:right w:w="80" w:type="dxa"/>
-            </w:tcMar>
+                <w:sz w:val="17"/>
+                <w:szCs w:val="17"/>
+              </w:rPr>
+              <w:t xml:space="preserve">AO a A1</w:t>
+            </w:r>
+          </w:p>
+        </w:tc>
+        <w:tc>
+          <w:tcPr>
+            <w:tcW w:w="4500" w:type="dxa"/>
+            <w:tcMar>
+              <w:top w:w="70" w:type="dxa"/>
+              <w:left w:w="110" w:type="dxa"/>
+              <w:bottom w:w="70" w:type="dxa"/>
+              <w:right w:w="110" w:type="dxa"/>
+            </w:tcMar>
+            <w:vAlign w:val="center"/>
           </w:tcPr>
           <w:p>
             <w:pPr>
@@ -1461,10 +1568,10 @@
             <w:r>
               <w:rPr>
                 <w:rFonts w:ascii="Arial" w:hAnsi="Arial" w:cs="Arial"/>
-                <w:sz w:val="16"/>
-                <w:szCs w:val="16"/>
-              </w:rPr>
-              <w:t xml:space="preserve">Valor alto = oscuridad; umbral limitado a 950 para no quedar “sordo”.</w:t>
+                <w:sz w:val="17"/>
+                <w:szCs w:val="17"/>
+              </w:rPr>
+              <w:t xml:space="preserve">Detecta cuando el lugar queda a oscuras.</w:t>
             </w:r>
           </w:p>
         </w:tc>
@@ -1475,13 +1582,14 @@
         </w:trPr>
         <w:tc>
           <w:tcPr>
-            <w:tcW w:w="2600" w:type="dxa"/>
-            <w:tcMar>
-              <w:top w:w="40" w:type="dxa"/>
-              <w:left w:w="80" w:type="dxa"/>
-              <w:bottom w:w="40" w:type="dxa"/>
-              <w:right w:w="80" w:type="dxa"/>
-            </w:tcMar>
+            <w:tcW w:w="3000" w:type="dxa"/>
+            <w:tcMar>
+              <w:top w:w="70" w:type="dxa"/>
+              <w:left w:w="110" w:type="dxa"/>
+              <w:bottom w:w="70" w:type="dxa"/>
+              <w:right w:w="110" w:type="dxa"/>
+            </w:tcMar>
+            <w:vAlign w:val="center"/>
           </w:tcPr>
           <w:p>
             <w:pPr>
@@ -1491,22 +1599,23 @@
             <w:r>
               <w:rPr>
                 <w:rFonts w:ascii="Arial" w:hAnsi="Arial" w:cs="Arial"/>
-                <w:sz w:val="16"/>
-                <w:szCs w:val="16"/>
-              </w:rPr>
-              <w:t xml:space="preserve">Ultrasónico HC-SR04</w:t>
-            </w:r>
-          </w:p>
-        </w:tc>
-        <w:tc>
-          <w:tcPr>
-            <w:tcW w:w="2400" w:type="dxa"/>
-            <w:tcMar>
-              <w:top w:w="40" w:type="dxa"/>
-              <w:left w:w="80" w:type="dxa"/>
-              <w:bottom w:w="40" w:type="dxa"/>
-              <w:right w:w="80" w:type="dxa"/>
-            </w:tcMar>
+                <w:sz w:val="17"/>
+                <w:szCs w:val="17"/>
+              </w:rPr>
+              <w:t xml:space="preserve">Sensor ultrasónico HC-SR04</w:t>
+            </w:r>
+          </w:p>
+        </w:tc>
+        <w:tc>
+          <w:tcPr>
+            <w:tcW w:w="3000" w:type="dxa"/>
+            <w:tcMar>
+              <w:top w:w="70" w:type="dxa"/>
+              <w:left w:w="110" w:type="dxa"/>
+              <w:bottom w:w="70" w:type="dxa"/>
+              <w:right w:w="110" w:type="dxa"/>
+            </w:tcMar>
+            <w:vAlign w:val="center"/>
           </w:tcPr>
           <w:p>
             <w:pPr>
@@ -1516,22 +1625,23 @@
             <w:r>
               <w:rPr>
                 <w:rFonts w:ascii="Arial" w:hAnsi="Arial" w:cs="Arial"/>
-                <w:sz w:val="16"/>
-                <w:szCs w:val="16"/>
-              </w:rPr>
-              <w:t xml:space="preserve">Trig ← D9, Echo → D10</w:t>
-            </w:r>
-          </w:p>
-        </w:tc>
-        <w:tc>
-          <w:tcPr>
-            <w:tcW w:w="5500" w:type="dxa"/>
-            <w:tcMar>
-              <w:top w:w="40" w:type="dxa"/>
-              <w:left w:w="80" w:type="dxa"/>
-              <w:bottom w:w="40" w:type="dxa"/>
-              <w:right w:w="80" w:type="dxa"/>
-            </w:tcMar>
+                <w:sz w:val="17"/>
+                <w:szCs w:val="17"/>
+              </w:rPr>
+              <w:t xml:space="preserve">Trig a D9 y Echo a D10</w:t>
+            </w:r>
+          </w:p>
+        </w:tc>
+        <w:tc>
+          <w:tcPr>
+            <w:tcW w:w="4500" w:type="dxa"/>
+            <w:tcMar>
+              <w:top w:w="70" w:type="dxa"/>
+              <w:left w:w="110" w:type="dxa"/>
+              <w:bottom w:w="70" w:type="dxa"/>
+              <w:right w:w="110" w:type="dxa"/>
+            </w:tcMar>
+            <w:vAlign w:val="center"/>
           </w:tcPr>
           <w:p>
             <w:pPr>
@@ -1541,10 +1651,10 @@
             <w:r>
               <w:rPr>
                 <w:rFonts w:ascii="Arial" w:hAnsi="Arial" w:cs="Arial"/>
-                <w:sz w:val="16"/>
-                <w:szCs w:val="16"/>
-              </w:rPr>
-              <w:t xml:space="preserve">d = t × 0,0343 / 2; alerta bajo 50 cm; timeout 12 ms.</w:t>
+                <w:sz w:val="17"/>
+                <w:szCs w:val="17"/>
+              </w:rPr>
+              <w:t xml:space="preserve">Mide la distancia; alerta bajo 50 cm.</w:t>
             </w:r>
           </w:p>
         </w:tc>
@@ -1555,13 +1665,14 @@
         </w:trPr>
         <w:tc>
           <w:tcPr>
-            <w:tcW w:w="2600" w:type="dxa"/>
-            <w:tcMar>
-              <w:top w:w="40" w:type="dxa"/>
-              <w:left w:w="80" w:type="dxa"/>
-              <w:bottom w:w="40" w:type="dxa"/>
-              <w:right w:w="80" w:type="dxa"/>
-            </w:tcMar>
+            <w:tcW w:w="3000" w:type="dxa"/>
+            <w:tcMar>
+              <w:top w:w="70" w:type="dxa"/>
+              <w:left w:w="110" w:type="dxa"/>
+              <w:bottom w:w="70" w:type="dxa"/>
+              <w:right w:w="110" w:type="dxa"/>
+            </w:tcMar>
+            <w:vAlign w:val="center"/>
           </w:tcPr>
           <w:p>
             <w:pPr>
@@ -1571,22 +1682,23 @@
             <w:r>
               <w:rPr>
                 <w:rFonts w:ascii="Arial" w:hAnsi="Arial" w:cs="Arial"/>
-                <w:sz w:val="16"/>
-                <w:szCs w:val="16"/>
-              </w:rPr>
-              <w:t xml:space="preserve">Actuadores / salidas</w:t>
-            </w:r>
-          </w:p>
-        </w:tc>
-        <w:tc>
-          <w:tcPr>
-            <w:tcW w:w="2400" w:type="dxa"/>
-            <w:tcMar>
-              <w:top w:w="40" w:type="dxa"/>
-              <w:left w:w="80" w:type="dxa"/>
-              <w:bottom w:w="40" w:type="dxa"/>
-              <w:right w:w="80" w:type="dxa"/>
-            </w:tcMar>
+                <w:sz w:val="17"/>
+                <w:szCs w:val="17"/>
+              </w:rPr>
+              <w:t xml:space="preserve">Actuadores y salidas</w:t>
+            </w:r>
+          </w:p>
+        </w:tc>
+        <w:tc>
+          <w:tcPr>
+            <w:tcW w:w="3000" w:type="dxa"/>
+            <w:tcMar>
+              <w:top w:w="70" w:type="dxa"/>
+              <w:left w:w="110" w:type="dxa"/>
+              <w:bottom w:w="70" w:type="dxa"/>
+              <w:right w:w="110" w:type="dxa"/>
+            </w:tcMar>
+            <w:vAlign w:val="center"/>
           </w:tcPr>
           <w:p>
             <w:pPr>
@@ -1596,22 +1708,23 @@
             <w:r>
               <w:rPr>
                 <w:rFonts w:ascii="Arial" w:hAnsi="Arial" w:cs="Arial"/>
-                <w:sz w:val="16"/>
-                <w:szCs w:val="16"/>
-              </w:rPr>
-              <w:t xml:space="preserve">D9 (Trig) y vía nube</w:t>
-            </w:r>
-          </w:p>
-        </w:tc>
-        <w:tc>
-          <w:tcPr>
-            <w:tcW w:w="5500" w:type="dxa"/>
-            <w:tcMar>
-              <w:top w:w="40" w:type="dxa"/>
-              <w:left w:w="80" w:type="dxa"/>
-              <w:bottom w:w="40" w:type="dxa"/>
-              <w:right w:w="80" w:type="dxa"/>
-            </w:tcMar>
+                <w:sz w:val="17"/>
+                <w:szCs w:val="17"/>
+              </w:rPr>
+              <w:t xml:space="preserve">D9 y servicios en la nube</w:t>
+            </w:r>
+          </w:p>
+        </w:tc>
+        <w:tc>
+          <w:tcPr>
+            <w:tcW w:w="4500" w:type="dxa"/>
+            <w:tcMar>
+              <w:top w:w="70" w:type="dxa"/>
+              <w:left w:w="110" w:type="dxa"/>
+              <w:bottom w:w="70" w:type="dxa"/>
+              <w:right w:w="110" w:type="dxa"/>
+            </w:tcMar>
+            <w:vAlign w:val="center"/>
           </w:tcPr>
           <w:p>
             <w:pPr>
@@ -1621,10 +1734,10 @@
             <w:r>
               <w:rPr>
                 <w:rFonts w:ascii="Arial" w:hAnsi="Arial" w:cs="Arial"/>
-                <w:sz w:val="16"/>
-                <w:szCs w:val="16"/>
-              </w:rPr>
-              <w:t xml:space="preserve">Pulso de disparo del HC-SR04; alarma sonora y visual en la app, SMS (Twilio), push y foto automática.</w:t>
+                <w:sz w:val="17"/>
+                <w:szCs w:val="17"/>
+              </w:rPr>
+              <w:t xml:space="preserve">Alarma en la app, SMS, push y fotografía.</w:t>
             </w:r>
           </w:p>
         </w:tc>
@@ -1632,14 +1745,22 @@
     </w:tbl>
     <w:p>
       <w:pPr>
-        <w:spacing w:after="60"/>
-      </w:pPr>
-    </w:p>
-    <w:p>
-      <w:pPr>
-        <w:spacing w:after="120" w:line="240" w:lineRule="auto"/>
+        <w:spacing w:after="120"/>
+      </w:pPr>
+    </w:p>
+    <w:p>
+      <w:pPr>
+        <w:spacing w:after="200" w:line="276" w:lineRule="auto"/>
         <w:jc w:val="both"/>
       </w:pPr>
+      <w:r>
+        <w:rPr>
+          <w:rFonts w:ascii="Arial" w:hAnsi="Arial" w:cs="Arial"/>
+          <w:sz w:val="22"/>
+          <w:szCs w:val="22"/>
+        </w:rPr>
+        <w:t xml:space="preserve">La alarma se activa solo cuando ocurren tres cosas al mismo tiempo: </w:t>
+      </w:r>
       <w:r>
         <w:rPr>
           <w:rFonts w:ascii="Arial" w:hAnsi="Arial" w:cs="Arial"/>
@@ -1648,63 +1769,27 @@
           <w:sz w:val="22"/>
           <w:szCs w:val="22"/>
         </w:rPr>
-        <w:t xml:space="preserve">Lógica de detección:</w:t>
-      </w:r>
-      <w:r>
-        <w:rPr>
-          <w:rFonts w:ascii="Arial" w:hAnsi="Arial" w:cs="Arial"/>
-          <w:sz w:val="22"/>
-          <w:szCs w:val="22"/>
-        </w:rPr>
-        <w:t xml:space="preserve"> la alarma se activa solo si hay </w:t>
-      </w:r>
-      <w:r>
-        <w:rPr>
-          <w:rFonts w:ascii="Arial" w:hAnsi="Arial" w:cs="Arial"/>
-          <w:b/>
-          <w:bCs/>
-          <w:sz w:val="22"/>
-          <w:szCs w:val="22"/>
-        </w:rPr>
-        <w:t xml:space="preserve">ruido Y oscuridad Y un objeto a menos de 50 cm</w:t>
-      </w:r>
-      <w:r>
-        <w:rPr>
-          <w:rFonts w:ascii="Arial" w:hAnsi="Arial" w:cs="Arial"/>
-          <w:sz w:val="22"/>
-          <w:szCs w:val="22"/>
-        </w:rPr>
-        <w:t xml:space="preserve"> durante </w:t>
-      </w:r>
-      <w:r>
-        <w:rPr>
-          <w:rFonts w:ascii="Arial" w:hAnsi="Arial" w:cs="Arial"/>
-          <w:b/>
-          <w:bCs/>
-          <w:sz w:val="22"/>
-          <w:szCs w:val="22"/>
-        </w:rPr>
-        <w:t xml:space="preserve">3 lecturas consecutivas</w:t>
-      </w:r>
-      <w:r>
-        <w:rPr>
-          <w:rFonts w:ascii="Arial" w:hAnsi="Arial" w:cs="Arial"/>
-          <w:sz w:val="22"/>
-          <w:szCs w:val="22"/>
-        </w:rPr>
-        <w:t xml:space="preserve">; dura 5 s y luego exige 10 lecturas despejadas para rearmarse. Los umbrales no son fijos: al encender, el sistema calibra el reposo de cada sensor (umbral = reposo + max(4·fluctuación, fracción·reposo, piso)) y cada 60 s se adapta a la deriva ambiental. La pantalla LCD I2C inicial se retiró porque bloqueaba el sistema ~17 s; se propone agregar un buzzer o sirena local controlado por transistor.</w:t>
+        <w:t xml:space="preserve">hay ruido, está oscuro y hay algo a menos de 50 cm</w:t>
+      </w:r>
+      <w:r>
+        <w:rPr>
+          <w:rFonts w:ascii="Arial" w:hAnsi="Arial" w:cs="Arial"/>
+          <w:sz w:val="22"/>
+          <w:szCs w:val="22"/>
+        </w:rPr>
+        <w:t xml:space="preserve">, y esto se repite en tres lecturas seguidas. Así se evitan falsas alarmas por un ruido aislado. Además, como cada módulo entregaba valores distintos, el sistema calibra sus propios umbrales al encender y los ajusta cada minuto según el ambiente. La pantalla LCD que se usó al principio se retiró porque congelaba el Arduino hasta 17 segundos.</w:t>
       </w:r>
     </w:p>
     <w:p>
       <w:pPr>
         <w:keepNext/>
-        <w:spacing w:before="120" w:after="0"/>
+        <w:spacing w:before="240" w:after="0"/>
         <w:jc w:val="center"/>
       </w:pPr>
       <w:r>
         <w:drawing>
           <wp:inline distT="0" distB="0" distL="0" distR="0">
-            <wp:extent cx="5580000" cy="1674000"/>
+            <wp:extent cx="5400000" cy="3317142"/>
             <wp:docPr id="102" name="Imagen 102"/>
             <a:graphic xmlns:a="http://schemas.openxmlformats.org/drawingml/2006/main">
               <a:graphicData uri="http://schemas.openxmlformats.org/drawingml/2006/picture">
@@ -1722,7 +1807,7 @@
                   <pic:spPr>
                     <a:xfrm>
                       <a:off x="0" y="0"/>
-                      <a:ext cx="5580000" cy="1674000"/>
+                      <a:ext cx="5400000" cy="3317142"/>
                     </a:xfrm>
                     <a:prstGeom prst="rect">
                       <a:avLst/>
@@ -1737,7 +1822,7 @@
     </w:p>
     <w:p>
       <w:pPr>
-        <w:spacing w:before="60" w:after="160"/>
+        <w:spacing w:before="100" w:after="280"/>
         <w:jc w:val="center"/>
       </w:pPr>
       <w:r>
@@ -1760,82 +1845,69 @@
           <w:sz w:val="18"/>
           <w:szCs w:val="18"/>
         </w:rPr>
-        <w:t xml:space="preserve">Lógica de detección del firmware. Fuente: elaboración propia.</w:t>
+        <w:t xml:space="preserve">Esquema de conexión del prototipo. Fuente: elaboración propia.</w:t>
       </w:r>
     </w:p>
     <w:p>
       <w:pPr>
         <w:keepNext/>
-        <w:spacing w:before="120" w:after="0"/>
-        <w:jc w:val="center"/>
-      </w:pPr>
-      <w:r>
-        <w:drawing>
-          <wp:inline distT="0" distB="0" distL="0" distR="0">
-            <wp:extent cx="5580000" cy="3427714"/>
-            <wp:docPr id="103" name="Imagen 103"/>
-            <a:graphic xmlns:a="http://schemas.openxmlformats.org/drawingml/2006/main">
-              <a:graphicData uri="http://schemas.openxmlformats.org/drawingml/2006/picture">
-                <pic:pic xmlns:pic="http://schemas.openxmlformats.org/drawingml/2006/picture">
-                  <pic:nvPicPr>
-                    <pic:cNvPr id="103" name="Imagen 103"/>
-                    <pic:cNvPicPr/>
-                  </pic:nvPicPr>
-                  <pic:blipFill>
-                    <a:blip r:embed="rIdImg3"/>
-                    <a:stretch>
-                      <a:fillRect/>
-                    </a:stretch>
-                  </pic:blipFill>
-                  <pic:spPr>
-                    <a:xfrm>
-                      <a:off x="0" y="0"/>
-                      <a:ext cx="5580000" cy="3427714"/>
-                    </a:xfrm>
-                    <a:prstGeom prst="rect">
-                      <a:avLst/>
-                    </a:prstGeom>
-                  </pic:spPr>
-                </pic:pic>
-              </a:graphicData>
-            </a:graphic>
-          </wp:inline>
-        </w:drawing>
-      </w:r>
-    </w:p>
-    <w:p>
-      <w:pPr>
-        <w:spacing w:before="60" w:after="160"/>
-        <w:jc w:val="center"/>
+        <w:spacing w:before="160" w:after="100"/>
+        <w:jc w:val="left"/>
       </w:pPr>
       <w:r>
         <w:rPr>
           <w:rFonts w:ascii="Arial" w:hAnsi="Arial" w:cs="Arial"/>
           <w:b/>
           <w:bCs/>
-          <w:i/>
           <w:color w:val="404040"/>
-          <w:sz w:val="18"/>
-          <w:szCs w:val="18"/>
-        </w:rPr>
-        <w:t xml:space="preserve">Figura 3. </w:t>
-      </w:r>
-      <w:r>
-        <w:rPr>
-          <w:rFonts w:ascii="Arial" w:hAnsi="Arial" w:cs="Arial"/>
-          <w:i/>
-          <w:color w:val="404040"/>
-          <w:sz w:val="18"/>
-          <w:szCs w:val="18"/>
-        </w:rPr>
-        <w:t xml:space="preserve">Esquema de conexión del prototipo. Fuente: elaboración propia.</w:t>
-      </w:r>
-    </w:p>
-    <w:p>
-      <w:pPr>
-        <w:spacing w:after="120" w:line="240" w:lineRule="auto"/>
+          <w:sz w:val="22"/>
+          <w:szCs w:val="22"/>
+        </w:rPr>
+        <w:t xml:space="preserve">Pruebas</w:t>
+      </w:r>
+    </w:p>
+    <w:p>
+      <w:pPr>
+        <w:spacing w:after="200" w:line="276" w:lineRule="auto"/>
         <w:jc w:val="both"/>
       </w:pPr>
+      <w:r>
+        <w:rPr>
+          <w:rFonts w:ascii="Arial" w:hAnsi="Arial" w:cs="Arial"/>
+          <w:sz w:val="22"/>
+          <w:szCs w:val="22"/>
+        </w:rPr>
+        <w:t xml:space="preserve">Las pruebas se hicieron con el monitor serie del Arduino IDE. Se revisó cada sensor por separado (aplausos, tapar el sensor de luz y acercar objetos a 100, 50 y 30 cm), se comprobó que con una o dos condiciones la alarma no se activa y que, después de sonar, espera a que la zona quede despejada antes de volver a armarse. También se cambió un sensor por otro del mismo modelo y el sistema funcionó sin reprogramarlo.</w:t>
+      </w:r>
+    </w:p>
+    <w:p>
+      <w:r>
+        <w:br w:type="page"/>
+      </w:r>
+    </w:p>
+    <w:p>
+      <w:pPr>
+        <w:pStyle w:val="Ttulo2"/>
+      </w:pPr>
+      <w:bookmarkStart w:id="4" w:name="_Toc900004"/>
+      <w:r>
+        <w:t xml:space="preserve">2.2 Comunicación inalámbrica y seguridad</w:t>
+      </w:r>
+      <w:bookmarkEnd w:id="4"/>
+    </w:p>
+    <w:p>
+      <w:pPr>
+        <w:spacing w:after="200" w:line="276" w:lineRule="auto"/>
+        <w:jc w:val="both"/>
+      </w:pPr>
+      <w:r>
+        <w:rPr>
+          <w:rFonts w:ascii="Arial" w:hAnsi="Arial" w:cs="Arial"/>
+          <w:sz w:val="22"/>
+          <w:szCs w:val="22"/>
+        </w:rPr>
+        <w:t xml:space="preserve">Se eligió </w:t>
+      </w:r>
       <w:r>
         <w:rPr>
           <w:rFonts w:ascii="Arial" w:hAnsi="Arial" w:cs="Arial"/>
@@ -1844,30 +1916,58 @@
           <w:sz w:val="22"/>
           <w:szCs w:val="22"/>
         </w:rPr>
-        <w:t xml:space="preserve">Pruebas:</w:t>
-      </w:r>
-      <w:r>
-        <w:rPr>
-          <w:rFonts w:ascii="Arial" w:hAnsi="Arial" w:cs="Arial"/>
-          <w:sz w:val="22"/>
-          <w:szCs w:val="22"/>
-        </w:rPr>
-        <w:t xml:space="preserve"> con el monitor serie (115.200 baudios) se validó la calibración, cada sensor por separado (aplausos, tapar la LDR, distancias de 100/50/30 cm), que 1 o 2 condiciones no disparan la alarma, la confirmación de 3 lecturas, el rearme y el funcionamiento con otro módulo sin reprogramar. Todas cumplieron tras retirar la LCD.</w:t>
+        <w:t xml:space="preserve">WiFi de 2,4 GHz</w:t>
+      </w:r>
+      <w:r>
+        <w:rPr>
+          <w:rFonts w:ascii="Arial" w:hAnsi="Arial" w:cs="Arial"/>
+          <w:sz w:val="22"/>
+          <w:szCs w:val="22"/>
+        </w:rPr>
+        <w:t xml:space="preserve"> usando la antena integrada de la placa, porque permite llegar a Internet directamente a través del router del lugar, sin costo adicional. Bluetooth se descartó porque necesita un teléfono cerca, LoRa porque requiere un equipo intermedio (gateway) y 4G por el costo mensual del plan, aunque sería un buen respaldo en una industria.</w:t>
+      </w:r>
+    </w:p>
+    <w:p>
+      <w:pPr>
+        <w:spacing w:after="200" w:line="276" w:lineRule="auto"/>
+        <w:jc w:val="both"/>
+      </w:pPr>
+      <w:r>
+        <w:rPr>
+          <w:rFonts w:ascii="Arial" w:hAnsi="Arial" w:cs="Arial"/>
+          <w:sz w:val="22"/>
+          <w:szCs w:val="22"/>
+        </w:rPr>
+        <w:t xml:space="preserve">Para la conexión se usó la librería oficial WiFiS3. Cada segundo el Arduino envía un mensaje con las lecturas al servidor por HTTPS, y si se cae la red vuelve a intentar conectarse cada vez con más espera, para no bloquear la detección.</w:t>
+      </w:r>
+    </w:p>
+    <w:p>
+      <w:pPr>
+        <w:spacing w:after="200" w:line="276" w:lineRule="auto"/>
+        <w:jc w:val="both"/>
+      </w:pPr>
+      <w:r>
+        <w:rPr>
+          <w:rFonts w:ascii="Arial" w:hAnsi="Arial" w:cs="Arial"/>
+          <w:sz w:val="22"/>
+          <w:szCs w:val="22"/>
+        </w:rPr>
+        <w:t xml:space="preserve">En seguridad se aplicaron varias medidas: red WiFi con clave WPA2, comunicación cifrada con HTTPS, inicio de sesión obligatorio, contraseñas guardadas de forma encriptada (bcrypt), sesiones con token JWT y las claves del sistema guardadas fuera del código. Como mejora, se sugiere que el Arduino también se identifique con una clave propia al enviar datos y sacar la contraseña del WiFi del programa.</w:t>
       </w:r>
     </w:p>
     <w:p>
       <w:pPr>
         <w:pStyle w:val="Ttulo2"/>
       </w:pPr>
-      <w:bookmarkStart w:id="4" w:name="_Toc900004"/>
-      <w:r>
-        <w:t xml:space="preserve">2.2 Comunicación inalámbrica y seguridad</w:t>
-      </w:r>
-      <w:bookmarkEnd w:id="4"/>
-    </w:p>
-    <w:p>
-      <w:pPr>
-        <w:spacing w:after="120" w:line="240" w:lineRule="auto"/>
+      <w:bookmarkStart w:id="5" w:name="_Toc900005"/>
+      <w:r>
+        <w:t xml:space="preserve">2.3 Aplicación móvil e IoT</w:t>
+      </w:r>
+      <w:bookmarkEnd w:id="5"/>
+    </w:p>
+    <w:p>
+      <w:pPr>
+        <w:spacing w:after="200" w:line="276" w:lineRule="auto"/>
         <w:jc w:val="both"/>
       </w:pPr>
       <w:r>
@@ -1876,233 +1976,7 @@
           <w:sz w:val="22"/>
           <w:szCs w:val="22"/>
         </w:rPr>
-        <w:t xml:space="preserve">Se seleccionó </w:t>
-      </w:r>
-      <w:r>
-        <w:rPr>
-          <w:rFonts w:ascii="Arial" w:hAnsi="Arial" w:cs="Arial"/>
-          <w:b/>
-          <w:bCs/>
-          <w:sz w:val="22"/>
-          <w:szCs w:val="22"/>
-        </w:rPr>
-        <w:t xml:space="preserve">WiFi 802.11 b/g/n (2,4 GHz)</w:t>
-      </w:r>
-      <w:r>
-        <w:rPr>
-          <w:rFonts w:ascii="Arial" w:hAnsi="Arial" w:cs="Arial"/>
-          <w:sz w:val="22"/>
-          <w:szCs w:val="22"/>
-        </w:rPr>
-        <w:t xml:space="preserve"> con la antena PCB integrada del ESP32-S3: da acceso directo a Internet por el router existente, sin costo ni gateway, y su ancho de banda sobra para un JSON de ~200 bytes por segundo. Se descartó </w:t>
-      </w:r>
-      <w:r>
-        <w:rPr>
-          <w:rFonts w:ascii="Arial" w:hAnsi="Arial" w:cs="Arial"/>
-          <w:b/>
-          <w:bCs/>
-          <w:sz w:val="22"/>
-          <w:szCs w:val="22"/>
-        </w:rPr>
-        <w:t xml:space="preserve">BLE</w:t>
-      </w:r>
-      <w:r>
-        <w:rPr>
-          <w:rFonts w:ascii="Arial" w:hAnsi="Arial" w:cs="Arial"/>
-          <w:sz w:val="22"/>
-          <w:szCs w:val="22"/>
-        </w:rPr>
-        <w:t xml:space="preserve"> (requiere teléfono puente), </w:t>
-      </w:r>
-      <w:r>
-        <w:rPr>
-          <w:rFonts w:ascii="Arial" w:hAnsi="Arial" w:cs="Arial"/>
-          <w:b/>
-          <w:bCs/>
-          <w:sz w:val="22"/>
-          <w:szCs w:val="22"/>
-        </w:rPr>
-        <w:t xml:space="preserve">LoRa</w:t>
-      </w:r>
-      <w:r>
-        <w:rPr>
-          <w:rFonts w:ascii="Arial" w:hAnsi="Arial" w:cs="Arial"/>
-          <w:sz w:val="22"/>
-          <w:szCs w:val="22"/>
-        </w:rPr>
-        <w:t xml:space="preserve"> (gateway y baja tasa) y </w:t>
-      </w:r>
-      <w:r>
-        <w:rPr>
-          <w:rFonts w:ascii="Arial" w:hAnsi="Arial" w:cs="Arial"/>
-          <w:b/>
-          <w:bCs/>
-          <w:sz w:val="22"/>
-          <w:szCs w:val="22"/>
-        </w:rPr>
-        <w:t xml:space="preserve">4G</w:t>
-      </w:r>
-      <w:r>
-        <w:rPr>
-          <w:rFonts w:ascii="Arial" w:hAnsi="Arial" w:cs="Arial"/>
-          <w:sz w:val="22"/>
-          <w:szCs w:val="22"/>
-        </w:rPr>
-        <w:t xml:space="preserve"> (costo mensual; útil como respaldo industrial).</w:t>
-      </w:r>
-    </w:p>
-    <w:p>
-      <w:pPr>
-        <w:spacing w:after="120" w:line="240" w:lineRule="auto"/>
-        <w:jc w:val="both"/>
-      </w:pPr>
-      <w:r>
-        <w:rPr>
-          <w:rFonts w:ascii="Arial" w:hAnsi="Arial" w:cs="Arial"/>
-          <w:b/>
-          <w:bCs/>
-          <w:sz w:val="22"/>
-          <w:szCs w:val="22"/>
-        </w:rPr>
-        <w:t xml:space="preserve">Integración y programación:</w:t>
-      </w:r>
-      <w:r>
-        <w:rPr>
-          <w:rFonts w:ascii="Arial" w:hAnsi="Arial" w:cs="Arial"/>
-          <w:sz w:val="22"/>
-          <w:szCs w:val="22"/>
-        </w:rPr>
-        <w:t xml:space="preserve"> se usó la librería oficial </w:t>
-      </w:r>
-      <w:r>
-        <w:rPr>
-          <w:rFonts w:ascii="Arial" w:hAnsi="Arial" w:cs="Arial"/>
-          <w:b/>
-          <w:bCs/>
-          <w:sz w:val="22"/>
-          <w:szCs w:val="22"/>
-        </w:rPr>
-        <w:t xml:space="preserve">WiFiS3</w:t>
-      </w:r>
-      <w:r>
-        <w:rPr>
-          <w:rFonts w:ascii="Arial" w:hAnsi="Arial" w:cs="Arial"/>
-          <w:sz w:val="22"/>
-          <w:szCs w:val="22"/>
-        </w:rPr>
-        <w:t xml:space="preserve"> (firmware del ESP32-S3 actualizado) y un cliente </w:t>
-      </w:r>
-      <w:r>
-        <w:rPr>
-          <w:rFonts w:ascii="Arial" w:hAnsi="Arial" w:cs="Arial"/>
-          <w:b/>
-          <w:bCs/>
-          <w:sz w:val="22"/>
-          <w:szCs w:val="22"/>
-        </w:rPr>
-        <w:t xml:space="preserve">WiFiSSLClient</w:t>
-      </w:r>
-      <w:r>
-        <w:rPr>
-          <w:rFonts w:ascii="Arial" w:hAnsi="Arial" w:cs="Arial"/>
-          <w:sz w:val="22"/>
-          <w:szCs w:val="22"/>
-        </w:rPr>
-        <w:t xml:space="preserve"> al puerto 443. El firmware envía cada 1 s (e inmediatamente al activarse la alarma) un POST JSON a /api/datos, armando la petición en un buffer y enviándola con un único write(); reutiliza la conexión TLS (keep-alive), lee la respuesta sin bloquear y aplica reintentos con backoff exponencial (WiFi 5–60 s, servidor 1–30 s), manteniendo el ciclo de detección en 50 ms.</w:t>
-      </w:r>
-    </w:p>
-    <w:p>
-      <w:pPr>
-        <w:spacing w:after="120" w:line="240" w:lineRule="auto"/>
-        <w:jc w:val="both"/>
-      </w:pPr>
-      <w:r>
-        <w:rPr>
-          <w:rFonts w:ascii="Arial" w:hAnsi="Arial" w:cs="Arial"/>
-          <w:b/>
-          <w:bCs/>
-          <w:sz w:val="22"/>
-          <w:szCs w:val="22"/>
-        </w:rPr>
-        <w:t xml:space="preserve">Seguridad implementada:</w:t>
-      </w:r>
-      <w:r>
-        <w:rPr>
-          <w:rFonts w:ascii="Arial" w:hAnsi="Arial" w:cs="Arial"/>
-          <w:sz w:val="22"/>
-          <w:szCs w:val="22"/>
-        </w:rPr>
-        <w:t xml:space="preserve"> red WPA2; HTTPS/TLS extremo a extremo; login obligatorio sin registro público; contraseñas con bcrypt; sesión JWT en cookie httpOnly + sameSite; Socket.IO autenticado; secretos (JWT, VAPID, Twilio, MongoDB) en variables de entorno; validación de entradas; video WebRTC cifrado punto a punto; y solo descriptores faciales (no fotos). </w:t>
-      </w:r>
-      <w:r>
-        <w:rPr>
-          <w:rFonts w:ascii="Arial" w:hAnsi="Arial" w:cs="Arial"/>
-          <w:b/>
-          <w:bCs/>
-          <w:sz w:val="22"/>
-          <w:szCs w:val="22"/>
-        </w:rPr>
-        <w:t xml:space="preserve">Mejoras sugeridas:</w:t>
-      </w:r>
-      <w:r>
-        <w:rPr>
-          <w:rFonts w:ascii="Arial" w:hAnsi="Arial" w:cs="Arial"/>
-          <w:sz w:val="22"/>
-          <w:szCs w:val="22"/>
-        </w:rPr>
-        <w:t xml:space="preserve"> autenticar al Arduino con clave de API/HMAC (hoy /api/datos es público), sacar las credenciales WiFi del código y segmentar la red IoT.</w:t>
-      </w:r>
-    </w:p>
-    <w:p>
-      <w:pPr>
-        <w:pStyle w:val="Ttulo2"/>
-      </w:pPr>
-      <w:bookmarkStart w:id="5" w:name="_Toc900005"/>
-      <w:r>
-        <w:t xml:space="preserve">2.3 Aplicación móvil e IoT</w:t>
-      </w:r>
-      <w:bookmarkEnd w:id="5"/>
-    </w:p>
-    <w:p>
-      <w:pPr>
-        <w:spacing w:after="120" w:line="240" w:lineRule="auto"/>
-        <w:jc w:val="both"/>
-      </w:pPr>
-      <w:r>
-        <w:rPr>
-          <w:rFonts w:ascii="Arial" w:hAnsi="Arial" w:cs="Arial"/>
-          <w:b/>
-          <w:bCs/>
-          <w:sz w:val="22"/>
-          <w:szCs w:val="22"/>
-        </w:rPr>
-        <w:t xml:space="preserve">Requisitos funcionales:</w:t>
-      </w:r>
-      <w:r>
-        <w:rPr>
-          <w:rFonts w:ascii="Arial" w:hAnsi="Arial" w:cs="Arial"/>
-          <w:sz w:val="22"/>
-          <w:szCs w:val="22"/>
-        </w:rPr>
-        <w:t xml:space="preserve"> login; estado y lecturas en vivo; detalle del sensor activado y alarma sonora silenciable; historial de las últimas 20 alertas con foto; push y SMS con botones de prueba; cámara en vivo; reconocimiento facial y gestión de personas conocidas. </w:t>
-      </w:r>
-      <w:r>
-        <w:rPr>
-          <w:rFonts w:ascii="Arial" w:hAnsi="Arial" w:cs="Arial"/>
-          <w:b/>
-          <w:bCs/>
-          <w:sz w:val="22"/>
-          <w:szCs w:val="22"/>
-        </w:rPr>
-        <w:t xml:space="preserve">No funcionales:</w:t>
-      </w:r>
-      <w:r>
-        <w:rPr>
-          <w:rFonts w:ascii="Arial" w:hAnsi="Arial" w:cs="Arial"/>
-          <w:sz w:val="22"/>
-          <w:szCs w:val="22"/>
-        </w:rPr>
-        <w:t xml:space="preserve"> latencia ≈ 1 s, HTTPS, acceso desde cualquier lugar, interfaz móvil (PWA) y privacidad biométrica.</w:t>
+        <w:t xml:space="preserve">La aplicación funciona desde el navegador del teléfono y se diseñó para usarse con una mano. Sus requisitos principales fueron: iniciar sesión, ver los sensores en tiempo real, recibir alertas, revisar el historial con fotos, ver la cámara en vivo y reconocer a las personas registradas. Tiene cuatro pestañas: Inicio, Historial, Cámara y Alertas (Figura 3).</w:t>
       </w:r>
     </w:p>
     <w:tbl>
@@ -2139,7 +2013,64 @@
             <w:r>
               <w:drawing>
                 <wp:inline distT="0" distB="0" distL="0" distR="0">
-                  <wp:extent cx="1296000" cy="2372957"/>
+                  <wp:extent cx="1224000" cy="2241126"/>
+                  <wp:docPr id="103" name="Imagen 103"/>
+                  <a:graphic xmlns:a="http://schemas.openxmlformats.org/drawingml/2006/main">
+                    <a:graphicData uri="http://schemas.openxmlformats.org/drawingml/2006/picture">
+                      <pic:pic xmlns:pic="http://schemas.openxmlformats.org/drawingml/2006/picture">
+                        <pic:nvPicPr>
+                          <pic:cNvPr id="103" name="Imagen 103"/>
+                          <pic:cNvPicPr/>
+                        </pic:nvPicPr>
+                        <pic:blipFill>
+                          <a:blip r:embed="rIdImg3"/>
+                          <a:stretch>
+                            <a:fillRect/>
+                          </a:stretch>
+                        </pic:blipFill>
+                        <pic:spPr>
+                          <a:xfrm>
+                            <a:off x="0" y="0"/>
+                            <a:ext cx="1224000" cy="2241126"/>
+                          </a:xfrm>
+                          <a:prstGeom prst="rect">
+                            <a:avLst/>
+                          </a:prstGeom>
+                        </pic:spPr>
+                      </pic:pic>
+                    </a:graphicData>
+                  </a:graphic>
+                </wp:inline>
+              </w:drawing>
+            </w:r>
+          </w:p>
+          <w:p>
+            <w:pPr>
+              <w:jc w:val="center"/>
+            </w:pPr>
+            <w:r>
+              <w:rPr>
+                <w:rFonts w:ascii="Arial" w:hAnsi="Arial" w:cs="Arial"/>
+                <w:i/>
+                <w:sz w:val="17"/>
+                <w:szCs w:val="17"/>
+              </w:rPr>
+              <w:t xml:space="preserve">a) Inicio</w:t>
+            </w:r>
+          </w:p>
+        </w:tc>
+        <w:tc>
+          <w:tcPr>
+            <w:tcW w:w="3500" w:type="dxa"/>
+          </w:tcPr>
+          <w:p>
+            <w:pPr>
+              <w:jc w:val="center"/>
+            </w:pPr>
+            <w:r>
+              <w:drawing>
+                <wp:inline distT="0" distB="0" distL="0" distR="0">
+                  <wp:extent cx="1224000" cy="2256439"/>
                   <wp:docPr id="104" name="Imagen 104"/>
                   <a:graphic xmlns:a="http://schemas.openxmlformats.org/drawingml/2006/main">
                     <a:graphicData uri="http://schemas.openxmlformats.org/drawingml/2006/picture">
@@ -2157,7 +2088,7 @@
                         <pic:spPr>
                           <a:xfrm>
                             <a:off x="0" y="0"/>
-                            <a:ext cx="1296000" cy="2372957"/>
+                            <a:ext cx="1224000" cy="2256439"/>
                           </a:xfrm>
                           <a:prstGeom prst="rect">
                             <a:avLst/>
@@ -2181,7 +2112,7 @@
                 <w:sz w:val="17"/>
                 <w:szCs w:val="17"/>
               </w:rPr>
-              <w:t xml:space="preserve">a) Inicio</w:t>
+              <w:t xml:space="preserve">b) Cámara</w:t>
             </w:r>
           </w:p>
         </w:tc>
@@ -2196,7 +2127,7 @@
             <w:r>
               <w:drawing>
                 <wp:inline distT="0" distB="0" distL="0" distR="0">
-                  <wp:extent cx="1296000" cy="2389170"/>
+                  <wp:extent cx="864000" cy="1870635"/>
                   <wp:docPr id="105" name="Imagen 105"/>
                   <a:graphic xmlns:a="http://schemas.openxmlformats.org/drawingml/2006/main">
                     <a:graphicData uri="http://schemas.openxmlformats.org/drawingml/2006/picture">
@@ -2214,7 +2145,7 @@
                         <pic:spPr>
                           <a:xfrm>
                             <a:off x="0" y="0"/>
-                            <a:ext cx="1296000" cy="2389170"/>
+                            <a:ext cx="864000" cy="1870635"/>
                           </a:xfrm>
                           <a:prstGeom prst="rect">
                             <a:avLst/>
@@ -2238,63 +2169,6 @@
                 <w:sz w:val="17"/>
                 <w:szCs w:val="17"/>
               </w:rPr>
-              <w:t xml:space="preserve">b) Cámara con reconocimiento</w:t>
-            </w:r>
-          </w:p>
-        </w:tc>
-        <w:tc>
-          <w:tcPr>
-            <w:tcW w:w="3500" w:type="dxa"/>
-          </w:tcPr>
-          <w:p>
-            <w:pPr>
-              <w:jc w:val="center"/>
-            </w:pPr>
-            <w:r>
-              <w:drawing>
-                <wp:inline distT="0" distB="0" distL="0" distR="0">
-                  <wp:extent cx="900000" cy="1948579"/>
-                  <wp:docPr id="106" name="Imagen 106"/>
-                  <a:graphic xmlns:a="http://schemas.openxmlformats.org/drawingml/2006/main">
-                    <a:graphicData uri="http://schemas.openxmlformats.org/drawingml/2006/picture">
-                      <pic:pic xmlns:pic="http://schemas.openxmlformats.org/drawingml/2006/picture">
-                        <pic:nvPicPr>
-                          <pic:cNvPr id="106" name="Imagen 106"/>
-                          <pic:cNvPicPr/>
-                        </pic:nvPicPr>
-                        <pic:blipFill>
-                          <a:blip r:embed="rIdImg6"/>
-                          <a:stretch>
-                            <a:fillRect/>
-                          </a:stretch>
-                        </pic:blipFill>
-                        <pic:spPr>
-                          <a:xfrm>
-                            <a:off x="0" y="0"/>
-                            <a:ext cx="900000" cy="1948579"/>
-                          </a:xfrm>
-                          <a:prstGeom prst="rect">
-                            <a:avLst/>
-                          </a:prstGeom>
-                        </pic:spPr>
-                      </pic:pic>
-                    </a:graphicData>
-                  </a:graphic>
-                </wp:inline>
-              </w:drawing>
-            </w:r>
-          </w:p>
-          <w:p>
-            <w:pPr>
-              <w:jc w:val="center"/>
-            </w:pPr>
-            <w:r>
-              <w:rPr>
-                <w:rFonts w:ascii="Arial" w:hAnsi="Arial" w:cs="Arial"/>
-                <w:i/>
-                <w:sz w:val="17"/>
-                <w:szCs w:val="17"/>
-              </w:rPr>
               <w:t xml:space="preserve">c) SMS de prueba</w:t>
             </w:r>
           </w:p>
@@ -2303,7 +2177,7 @@
     </w:tbl>
     <w:p>
       <w:pPr>
-        <w:spacing w:before="60" w:after="160"/>
+        <w:spacing w:before="100" w:after="280"/>
         <w:jc w:val="center"/>
       </w:pPr>
       <w:r>
@@ -2316,7 +2190,7 @@
           <w:sz w:val="18"/>
           <w:szCs w:val="18"/>
         </w:rPr>
-        <w:t xml:space="preserve">Figura 4. </w:t>
+        <w:t xml:space="preserve">Figura 3. </w:t>
       </w:r>
       <w:r>
         <w:rPr>
@@ -2326,281 +2200,65 @@
           <w:sz w:val="18"/>
           <w:szCs w:val="18"/>
         </w:rPr>
-        <w:t xml:space="preserve">Interfaces del aplicativo y evidencia de SMS. Fuente: capturas del sistema.</w:t>
-      </w:r>
-    </w:p>
-    <w:p>
-      <w:pPr>
-        <w:spacing w:after="120" w:line="240" w:lineRule="auto"/>
+        <w:t xml:space="preserve">Interfaces de la aplicación y SMS recibido. Fuente: capturas del sistema.</w:t>
+      </w:r>
+    </w:p>
+    <w:p>
+      <w:pPr>
+        <w:spacing w:after="200" w:line="276" w:lineRule="auto"/>
         <w:jc w:val="both"/>
       </w:pPr>
       <w:r>
         <w:rPr>
           <w:rFonts w:ascii="Arial" w:hAnsi="Arial" w:cs="Arial"/>
-          <w:b/>
-          <w:bCs/>
-          <w:sz w:val="22"/>
-          <w:szCs w:val="22"/>
-        </w:rPr>
-        <w:t xml:space="preserve">Diseño:</w:t>
-      </w:r>
-      <w:r>
-        <w:rPr>
-          <w:rFonts w:ascii="Arial" w:hAnsi="Arial" w:cs="Arial"/>
-          <w:sz w:val="22"/>
-          <w:szCs w:val="22"/>
-        </w:rPr>
-        <w:t xml:space="preserve"> barra inferior con </w:t>
-      </w:r>
-      <w:r>
-        <w:rPr>
-          <w:rFonts w:ascii="Arial" w:hAnsi="Arial" w:cs="Arial"/>
-          <w:b/>
-          <w:bCs/>
-          <w:sz w:val="22"/>
-          <w:szCs w:val="22"/>
-        </w:rPr>
-        <w:t xml:space="preserve">Inicio</w:t>
-      </w:r>
-      <w:r>
-        <w:rPr>
-          <w:rFonts w:ascii="Arial" w:hAnsi="Arial" w:cs="Arial"/>
-          <w:sz w:val="22"/>
-          <w:szCs w:val="22"/>
-        </w:rPr>
-        <w:t xml:space="preserve"> (estado Vigilando/Alarma, sensores en vivo y “Qué se activó”), </w:t>
-      </w:r>
-      <w:r>
-        <w:rPr>
-          <w:rFonts w:ascii="Arial" w:hAnsi="Arial" w:cs="Arial"/>
-          <w:b/>
-          <w:bCs/>
-          <w:sz w:val="22"/>
-          <w:szCs w:val="22"/>
-        </w:rPr>
-        <w:t xml:space="preserve">Historial</w:t>
-      </w:r>
-      <w:r>
-        <w:rPr>
-          <w:rFonts w:ascii="Arial" w:hAnsi="Arial" w:cs="Arial"/>
-          <w:sz w:val="22"/>
-          <w:szCs w:val="22"/>
-        </w:rPr>
-        <w:t xml:space="preserve"> (fecha, lecturas y foto), </w:t>
-      </w:r>
-      <w:r>
-        <w:rPr>
-          <w:rFonts w:ascii="Arial" w:hAnsi="Arial" w:cs="Arial"/>
-          <w:b/>
-          <w:bCs/>
-          <w:sz w:val="22"/>
-          <w:szCs w:val="22"/>
-        </w:rPr>
-        <w:t xml:space="preserve">Cámara</w:t>
-      </w:r>
-      <w:r>
-        <w:rPr>
-          <w:rFonts w:ascii="Arial" w:hAnsi="Arial" w:cs="Arial"/>
-          <w:sz w:val="22"/>
-          <w:szCs w:val="22"/>
-        </w:rPr>
-        <w:t xml:space="preserve"> (video, recuadros con nombre o “Desconocido” y detección de personas COCO-SSD) y </w:t>
-      </w:r>
-      <w:r>
-        <w:rPr>
-          <w:rFonts w:ascii="Arial" w:hAnsi="Arial" w:cs="Arial"/>
-          <w:b/>
-          <w:bCs/>
-          <w:sz w:val="22"/>
-          <w:szCs w:val="22"/>
-        </w:rPr>
-        <w:t xml:space="preserve">Alertas</w:t>
-      </w:r>
-      <w:r>
-        <w:rPr>
-          <w:rFonts w:ascii="Arial" w:hAnsi="Arial" w:cs="Arial"/>
-          <w:sz w:val="22"/>
-          <w:szCs w:val="22"/>
-        </w:rPr>
-        <w:t xml:space="preserve"> (activar push y número SMS).</w:t>
-      </w:r>
-    </w:p>
-    <w:p>
-      <w:pPr>
-        <w:spacing w:after="120" w:line="240" w:lineRule="auto"/>
+          <w:sz w:val="22"/>
+          <w:szCs w:val="22"/>
+        </w:rPr>
+        <w:t xml:space="preserve">La aplicación no se conecta directo al Arduino, sino a través del servidor. El Arduino envía los datos por HTTPS, el servidor los reenvía al instante con Socket.IO, el video de la cámara viaja por WebRTC y los avisos llegan por notificación push y SMS (Twilio). Se probó el inicio de sesión, la actualización de datos en cerca de un segundo, la alarma, el historial con foto, el SMS de prueba y el reconocimiento facial, y todo funcionó correctamente.</w:t>
+      </w:r>
+    </w:p>
+    <w:p>
+      <w:pPr>
+        <w:spacing w:after="200" w:line="276" w:lineRule="auto"/>
         <w:jc w:val="both"/>
       </w:pPr>
       <w:r>
         <w:rPr>
           <w:rFonts w:ascii="Arial" w:hAnsi="Arial" w:cs="Arial"/>
-          <w:b/>
-          <w:bCs/>
-          <w:sz w:val="22"/>
-          <w:szCs w:val="22"/>
-        </w:rPr>
-        <w:t xml:space="preserve">Integración con el hardware:</w:t>
-      </w:r>
-      <w:r>
-        <w:rPr>
-          <w:rFonts w:ascii="Arial" w:hAnsi="Arial" w:cs="Arial"/>
-          <w:sz w:val="22"/>
-          <w:szCs w:val="22"/>
-        </w:rPr>
-        <w:t xml:space="preserve"> Arduino → servidor por HTTPS/JSON; servidor → app por </w:t>
-      </w:r>
-      <w:r>
-        <w:rPr>
-          <w:rFonts w:ascii="Arial" w:hAnsi="Arial" w:cs="Arial"/>
-          <w:b/>
-          <w:bCs/>
-          <w:sz w:val="22"/>
-          <w:szCs w:val="22"/>
-        </w:rPr>
-        <w:t xml:space="preserve">Socket.IO</w:t>
-      </w:r>
-      <w:r>
-        <w:rPr>
-          <w:rFonts w:ascii="Arial" w:hAnsi="Arial" w:cs="Arial"/>
-          <w:sz w:val="22"/>
-          <w:szCs w:val="22"/>
-        </w:rPr>
-        <w:t xml:space="preserve"> en tiempo real (respaldo GET cada 3 s); celular-cámara ↔ app por </w:t>
-      </w:r>
-      <w:r>
-        <w:rPr>
-          <w:rFonts w:ascii="Arial" w:hAnsi="Arial" w:cs="Arial"/>
-          <w:b/>
-          <w:bCs/>
-          <w:sz w:val="22"/>
-          <w:szCs w:val="22"/>
-        </w:rPr>
-        <w:t xml:space="preserve">WebRTC</w:t>
-      </w:r>
-      <w:r>
-        <w:rPr>
-          <w:rFonts w:ascii="Arial" w:hAnsi="Arial" w:cs="Arial"/>
-          <w:sz w:val="22"/>
-          <w:szCs w:val="22"/>
-        </w:rPr>
-        <w:t xml:space="preserve">; avisos por </w:t>
-      </w:r>
-      <w:r>
-        <w:rPr>
-          <w:rFonts w:ascii="Arial" w:hAnsi="Arial" w:cs="Arial"/>
-          <w:b/>
-          <w:bCs/>
-          <w:sz w:val="22"/>
-          <w:szCs w:val="22"/>
-        </w:rPr>
-        <w:t xml:space="preserve">Web Push (VAPID)</w:t>
-      </w:r>
-      <w:r>
-        <w:rPr>
-          <w:rFonts w:ascii="Arial" w:hAnsi="Arial" w:cs="Arial"/>
-          <w:sz w:val="22"/>
-          <w:szCs w:val="22"/>
-        </w:rPr>
-        <w:t xml:space="preserve"> y </w:t>
-      </w:r>
-      <w:r>
-        <w:rPr>
-          <w:rFonts w:ascii="Arial" w:hAnsi="Arial" w:cs="Arial"/>
-          <w:b/>
-          <w:bCs/>
-          <w:sz w:val="22"/>
-          <w:szCs w:val="22"/>
-        </w:rPr>
-        <w:t xml:space="preserve">SMS (Twilio)</w:t>
-      </w:r>
-      <w:r>
-        <w:rPr>
-          <w:rFonts w:ascii="Arial" w:hAnsi="Arial" w:cs="Arial"/>
-          <w:sz w:val="22"/>
-          <w:szCs w:val="22"/>
-        </w:rPr>
-        <w:t xml:space="preserve"> una sola vez por alarma nueva; datos de usuarios y personas en </w:t>
-      </w:r>
-      <w:r>
-        <w:rPr>
-          <w:rFonts w:ascii="Arial" w:hAnsi="Arial" w:cs="Arial"/>
-          <w:b/>
-          <w:bCs/>
-          <w:sz w:val="22"/>
-          <w:szCs w:val="22"/>
-        </w:rPr>
-        <w:t xml:space="preserve">MongoDB</w:t>
-      </w:r>
-      <w:r>
-        <w:rPr>
-          <w:rFonts w:ascii="Arial" w:hAnsi="Arial" w:cs="Arial"/>
-          <w:sz w:val="22"/>
-          <w:szCs w:val="22"/>
-        </w:rPr>
-        <w:t xml:space="preserve">.</w:t>
-      </w:r>
-    </w:p>
-    <w:p>
-      <w:pPr>
-        <w:spacing w:after="120" w:line="240" w:lineRule="auto"/>
+          <w:sz w:val="22"/>
+          <w:szCs w:val="22"/>
+        </w:rPr>
+        <w:t xml:space="preserve">Pensando en la industria, la aplicación podría crecer agregando varios dispositivos por sitio, usuarios con distintos permisos, horarios de armado, reportes del historial y conexión con sistemas industriales mediante MQTT u OPC UA.</w:t>
+      </w:r>
+    </w:p>
+    <w:p>
+      <w:pPr>
+        <w:pStyle w:val="Ttulo2"/>
+      </w:pPr>
+      <w:bookmarkStart w:id="6" w:name="_Toc900006"/>
+      <w:r>
+        <w:t xml:space="preserve">2.4 Entornos, factibilidad y estándares OT</w:t>
+      </w:r>
+      <w:bookmarkEnd w:id="6"/>
+    </w:p>
+    <w:p>
+      <w:pPr>
+        <w:spacing w:after="200" w:line="276" w:lineRule="auto"/>
         <w:jc w:val="both"/>
       </w:pPr>
       <w:r>
         <w:rPr>
           <w:rFonts w:ascii="Arial" w:hAnsi="Arial" w:cs="Arial"/>
-          <w:b/>
-          <w:bCs/>
-          <w:sz w:val="22"/>
-          <w:szCs w:val="22"/>
-        </w:rPr>
-        <w:t xml:space="preserve">Pruebas:</w:t>
-      </w:r>
-      <w:r>
-        <w:rPr>
-          <w:rFonts w:ascii="Arial" w:hAnsi="Arial" w:cs="Arial"/>
-          <w:sz w:val="22"/>
-          <w:szCs w:val="22"/>
-        </w:rPr>
-        <w:t xml:space="preserve"> se validó login y protección de rutas (401/redirección), actualización en ≈ 1 s, alarma con detalle y silencio, historial con foto, push con la app cerrada, SMS de prueba (Figura 4c), video en vivo, reconocimiento facial (Figura 4b) y reconexión automática del Arduino.</w:t>
-      </w:r>
-    </w:p>
-    <w:p>
-      <w:pPr>
-        <w:spacing w:after="120" w:line="240" w:lineRule="auto"/>
-        <w:jc w:val="both"/>
-      </w:pPr>
-      <w:r>
-        <w:rPr>
-          <w:rFonts w:ascii="Arial" w:hAnsi="Arial" w:cs="Arial"/>
-          <w:b/>
-          <w:bCs/>
-          <w:sz w:val="22"/>
-          <w:szCs w:val="22"/>
-        </w:rPr>
-        <w:t xml:space="preserve">Escalabilidad:</w:t>
-      </w:r>
-      <w:r>
-        <w:rPr>
-          <w:rFonts w:ascii="Arial" w:hAnsi="Arial" w:cs="Arial"/>
-          <w:sz w:val="22"/>
-          <w:szCs w:val="22"/>
-        </w:rPr>
-        <w:t xml:space="preserve"> múltiples nodos por sitio y zona, usuarios con roles, armado por horario, historial persistente con reportes, migración a MQTT y OPC UA para integrarse con SCADA, actualización OTA y más sensores (PIR, magnéticos, cámaras IP).</w:t>
-      </w:r>
-    </w:p>
-    <w:p>
-      <w:pPr>
-        <w:pStyle w:val="Ttulo2"/>
-      </w:pPr>
-      <w:bookmarkStart w:id="6" w:name="_Toc900006"/>
-      <w:r>
-        <w:t xml:space="preserve">2.4 Entornos, factibilidad y estándares OT</w:t>
-      </w:r>
-      <w:bookmarkEnd w:id="6"/>
+          <w:sz w:val="22"/>
+          <w:szCs w:val="22"/>
+        </w:rPr>
+        <w:t xml:space="preserve">Se analizaron tres entornos donde el sistema podría implementarse. La Tabla 3 resume sus características, su factibilidad y lo que se recomienda en cada caso.</w:t>
+      </w:r>
     </w:p>
     <w:p>
       <w:pPr>
         <w:keepNext/>
-        <w:spacing w:before="60" w:after="160"/>
+        <w:spacing w:before="100" w:after="280"/>
         <w:jc w:val="center"/>
       </w:pPr>
       <w:r>
@@ -2623,7 +2281,7 @@
           <w:sz w:val="18"/>
           <w:szCs w:val="18"/>
         </w:rPr>
-        <w:t xml:space="preserve">Evaluación por entorno.</w:t>
+        <w:t xml:space="preserve">Evaluación de los entornos.</w:t>
       </w:r>
     </w:p>
     <w:tbl>
@@ -2641,10 +2299,10 @@
         <w:tblLayout w:type="fixed"/>
       </w:tblPr>
       <w:tblGrid>
-        <w:gridCol w:w="2100"/>
+        <w:gridCol w:w="2400"/>
+        <w:gridCol w:w="2600"/>
         <w:gridCol w:w="2700"/>
         <w:gridCol w:w="2800"/>
-        <w:gridCol w:w="2900"/>
       </w:tblGrid>
       <w:tr>
         <w:trPr>
@@ -2653,14 +2311,15 @@
         </w:trPr>
         <w:tc>
           <w:tcPr>
-            <w:tcW w:w="2100" w:type="dxa"/>
+            <w:tcW w:w="2400" w:type="dxa"/>
             <w:shd w:val="clear" w:color="auto" w:fill="C00000"/>
             <w:tcMar>
-              <w:top w:w="40" w:type="dxa"/>
-              <w:left w:w="80" w:type="dxa"/>
-              <w:bottom w:w="40" w:type="dxa"/>
-              <w:right w:w="80" w:type="dxa"/>
-            </w:tcMar>
+              <w:top w:w="70" w:type="dxa"/>
+              <w:left w:w="110" w:type="dxa"/>
+              <w:bottom w:w="70" w:type="dxa"/>
+              <w:right w:w="110" w:type="dxa"/>
+            </w:tcMar>
+            <w:vAlign w:val="center"/>
           </w:tcPr>
           <w:p>
             <w:pPr>
@@ -2673,8 +2332,8 @@
                 <w:b/>
                 <w:bCs/>
                 <w:color w:val="FFFFFF"/>
-                <w:sz w:val="16"/>
-                <w:szCs w:val="16"/>
+                <w:sz w:val="17"/>
+                <w:szCs w:val="17"/>
               </w:rPr>
               <w:t xml:space="preserve">Aspecto</w:t>
             </w:r>
@@ -2682,14 +2341,15 @@
         </w:tc>
         <w:tc>
           <w:tcPr>
-            <w:tcW w:w="2700" w:type="dxa"/>
+            <w:tcW w:w="2600" w:type="dxa"/>
             <w:shd w:val="clear" w:color="auto" w:fill="C00000"/>
             <w:tcMar>
-              <w:top w:w="40" w:type="dxa"/>
-              <w:left w:w="80" w:type="dxa"/>
-              <w:bottom w:w="40" w:type="dxa"/>
-              <w:right w:w="80" w:type="dxa"/>
-            </w:tcMar>
+              <w:top w:w="70" w:type="dxa"/>
+              <w:left w:w="110" w:type="dxa"/>
+              <w:bottom w:w="70" w:type="dxa"/>
+              <w:right w:w="110" w:type="dxa"/>
+            </w:tcMar>
+            <w:vAlign w:val="center"/>
           </w:tcPr>
           <w:p>
             <w:pPr>
@@ -2702,8 +2362,8 @@
                 <w:b/>
                 <w:bCs/>
                 <w:color w:val="FFFFFF"/>
-                <w:sz w:val="16"/>
-                <w:szCs w:val="16"/>
+                <w:sz w:val="17"/>
+                <w:szCs w:val="17"/>
               </w:rPr>
               <w:t xml:space="preserve">Vivienda</w:t>
             </w:r>
@@ -2711,14 +2371,15 @@
         </w:tc>
         <w:tc>
           <w:tcPr>
-            <w:tcW w:w="2800" w:type="dxa"/>
+            <w:tcW w:w="2700" w:type="dxa"/>
             <w:shd w:val="clear" w:color="auto" w:fill="C00000"/>
             <w:tcMar>
-              <w:top w:w="40" w:type="dxa"/>
-              <w:left w:w="80" w:type="dxa"/>
-              <w:bottom w:w="40" w:type="dxa"/>
-              <w:right w:w="80" w:type="dxa"/>
-            </w:tcMar>
+              <w:top w:w="70" w:type="dxa"/>
+              <w:left w:w="110" w:type="dxa"/>
+              <w:bottom w:w="70" w:type="dxa"/>
+              <w:right w:w="110" w:type="dxa"/>
+            </w:tcMar>
+            <w:vAlign w:val="center"/>
           </w:tcPr>
           <w:p>
             <w:pPr>
@@ -2731,8 +2392,8 @@
                 <w:b/>
                 <w:bCs/>
                 <w:color w:val="FFFFFF"/>
-                <w:sz w:val="16"/>
-                <w:szCs w:val="16"/>
+                <w:sz w:val="17"/>
+                <w:szCs w:val="17"/>
               </w:rPr>
               <w:t xml:space="preserve">Pequeño comercio</w:t>
             </w:r>
@@ -2740,14 +2401,15 @@
         </w:tc>
         <w:tc>
           <w:tcPr>
-            <w:tcW w:w="2900" w:type="dxa"/>
+            <w:tcW w:w="2800" w:type="dxa"/>
             <w:shd w:val="clear" w:color="auto" w:fill="C00000"/>
             <w:tcMar>
-              <w:top w:w="40" w:type="dxa"/>
-              <w:left w:w="80" w:type="dxa"/>
-              <w:bottom w:w="40" w:type="dxa"/>
-              <w:right w:w="80" w:type="dxa"/>
-            </w:tcMar>
+              <w:top w:w="70" w:type="dxa"/>
+              <w:left w:w="110" w:type="dxa"/>
+              <w:bottom w:w="70" w:type="dxa"/>
+              <w:right w:w="110" w:type="dxa"/>
+            </w:tcMar>
+            <w:vAlign w:val="center"/>
           </w:tcPr>
           <w:p>
             <w:pPr>
@@ -2760,8 +2422,8 @@
                 <w:b/>
                 <w:bCs/>
                 <w:color w:val="FFFFFF"/>
-                <w:sz w:val="16"/>
-                <w:szCs w:val="16"/>
+                <w:sz w:val="17"/>
+                <w:szCs w:val="17"/>
               </w:rPr>
               <w:t xml:space="preserve">Bodega industrial</w:t>
             </w:r>
@@ -2774,13 +2436,14 @@
         </w:trPr>
         <w:tc>
           <w:tcPr>
-            <w:tcW w:w="2100" w:type="dxa"/>
-            <w:tcMar>
-              <w:top w:w="40" w:type="dxa"/>
-              <w:left w:w="80" w:type="dxa"/>
-              <w:bottom w:w="40" w:type="dxa"/>
-              <w:right w:w="80" w:type="dxa"/>
-            </w:tcMar>
+            <w:tcW w:w="2400" w:type="dxa"/>
+            <w:tcMar>
+              <w:top w:w="70" w:type="dxa"/>
+              <w:left w:w="110" w:type="dxa"/>
+              <w:bottom w:w="70" w:type="dxa"/>
+              <w:right w:w="110" w:type="dxa"/>
+            </w:tcMar>
+            <w:vAlign w:val="center"/>
           </w:tcPr>
           <w:p>
             <w:pPr>
@@ -2790,10 +2453,36 @@
             <w:r>
               <w:rPr>
                 <w:rFonts w:ascii="Arial" w:hAnsi="Arial" w:cs="Arial"/>
-                <w:sz w:val="16"/>
-                <w:szCs w:val="16"/>
-              </w:rPr>
-              <w:t xml:space="preserve">Características</w:t>
+                <w:sz w:val="17"/>
+                <w:szCs w:val="17"/>
+              </w:rPr>
+              <w:t xml:space="preserve">Factibilidad técnica</w:t>
+            </w:r>
+          </w:p>
+        </w:tc>
+        <w:tc>
+          <w:tcPr>
+            <w:tcW w:w="2600" w:type="dxa"/>
+            <w:tcMar>
+              <w:top w:w="70" w:type="dxa"/>
+              <w:left w:w="110" w:type="dxa"/>
+              <w:bottom w:w="70" w:type="dxa"/>
+              <w:right w:w="110" w:type="dxa"/>
+            </w:tcMar>
+            <w:vAlign w:val="center"/>
+          </w:tcPr>
+          <w:p>
+            <w:pPr>
+              <w:spacing w:after="0" w:line="240" w:lineRule="auto"/>
+              <w:jc w:val="left"/>
+            </w:pPr>
+            <w:r>
+              <w:rPr>
+                <w:rFonts w:ascii="Arial" w:hAnsi="Arial" w:cs="Arial"/>
+                <w:sz w:val="17"/>
+                <w:szCs w:val="17"/>
+              </w:rPr>
+              <w:t xml:space="preserve">Alta</w:t>
             </w:r>
           </w:p>
         </w:tc>
@@ -2801,11 +2490,12 @@
           <w:tcPr>
             <w:tcW w:w="2700" w:type="dxa"/>
             <w:tcMar>
-              <w:top w:w="40" w:type="dxa"/>
-              <w:left w:w="80" w:type="dxa"/>
-              <w:bottom w:w="40" w:type="dxa"/>
-              <w:right w:w="80" w:type="dxa"/>
-            </w:tcMar>
+              <w:top w:w="70" w:type="dxa"/>
+              <w:left w:w="110" w:type="dxa"/>
+              <w:bottom w:w="70" w:type="dxa"/>
+              <w:right w:w="110" w:type="dxa"/>
+            </w:tcMar>
+            <w:vAlign w:val="center"/>
           </w:tcPr>
           <w:p>
             <w:pPr>
@@ -2815,10 +2505,10 @@
             <w:r>
               <w:rPr>
                 <w:rFonts w:ascii="Arial" w:hAnsi="Arial" w:cs="Arial"/>
-                <w:sz w:val="16"/>
-                <w:szCs w:val="16"/>
-              </w:rPr>
-              <w:t xml:space="preserve">WiFi doméstico, espacio pequeño y silencioso de noche</w:t>
+                <w:sz w:val="17"/>
+                <w:szCs w:val="17"/>
+              </w:rPr>
+              <w:t xml:space="preserve">Alta o media</w:t>
             </w:r>
           </w:p>
         </w:tc>
@@ -2826,11 +2516,12 @@
           <w:tcPr>
             <w:tcW w:w="2800" w:type="dxa"/>
             <w:tcMar>
-              <w:top w:w="40" w:type="dxa"/>
-              <w:left w:w="80" w:type="dxa"/>
-              <w:bottom w:w="40" w:type="dxa"/>
-              <w:right w:w="80" w:type="dxa"/>
-            </w:tcMar>
+              <w:top w:w="70" w:type="dxa"/>
+              <w:left w:w="110" w:type="dxa"/>
+              <w:bottom w:w="70" w:type="dxa"/>
+              <w:right w:w="110" w:type="dxa"/>
+            </w:tcMar>
+            <w:vAlign w:val="center"/>
           </w:tcPr>
           <w:p>
             <w:pPr>
@@ -2840,35 +2531,10 @@
             <w:r>
               <w:rPr>
                 <w:rFonts w:ascii="Arial" w:hAnsi="Arial" w:cs="Arial"/>
-                <w:sz w:val="16"/>
-                <w:szCs w:val="16"/>
-              </w:rPr>
-              <w:t xml:space="preserve">Horario definido, ruido de calle, vitrinas iluminadas</w:t>
-            </w:r>
-          </w:p>
-        </w:tc>
-        <w:tc>
-          <w:tcPr>
-            <w:tcW w:w="2900" w:type="dxa"/>
-            <w:tcMar>
-              <w:top w:w="40" w:type="dxa"/>
-              <w:left w:w="80" w:type="dxa"/>
-              <w:bottom w:w="40" w:type="dxa"/>
-              <w:right w:w="80" w:type="dxa"/>
-            </w:tcMar>
-          </w:tcPr>
-          <w:p>
-            <w:pPr>
-              <w:spacing w:after="0" w:line="240" w:lineRule="auto"/>
-              <w:jc w:val="left"/>
-            </w:pPr>
-            <w:r>
-              <w:rPr>
-                <w:rFonts w:ascii="Arial" w:hAnsi="Arial" w:cs="Arial"/>
-                <w:sz w:val="16"/>
-                <w:szCs w:val="16"/>
-              </w:rPr>
-              <w:t xml:space="preserve">Gran superficie, metal, ruido de maquinaria, polvo</w:t>
+                <w:sz w:val="17"/>
+                <w:szCs w:val="17"/>
+              </w:rPr>
+              <w:t xml:space="preserve">Media</w:t>
             </w:r>
           </w:p>
         </w:tc>
@@ -2879,13 +2545,14 @@
         </w:trPr>
         <w:tc>
           <w:tcPr>
-            <w:tcW w:w="2100" w:type="dxa"/>
-            <w:tcMar>
-              <w:top w:w="40" w:type="dxa"/>
-              <w:left w:w="80" w:type="dxa"/>
-              <w:bottom w:w="40" w:type="dxa"/>
-              <w:right w:w="80" w:type="dxa"/>
-            </w:tcMar>
+            <w:tcW w:w="2400" w:type="dxa"/>
+            <w:tcMar>
+              <w:top w:w="70" w:type="dxa"/>
+              <w:left w:w="110" w:type="dxa"/>
+              <w:bottom w:w="70" w:type="dxa"/>
+              <w:right w:w="110" w:type="dxa"/>
+            </w:tcMar>
+            <w:vAlign w:val="center"/>
           </w:tcPr>
           <w:p>
             <w:pPr>
@@ -2895,10 +2562,36 @@
             <w:r>
               <w:rPr>
                 <w:rFonts w:ascii="Arial" w:hAnsi="Arial" w:cs="Arial"/>
-                <w:sz w:val="16"/>
-                <w:szCs w:val="16"/>
-              </w:rPr>
-              <w:t xml:space="preserve">Factibilidad técnica</w:t>
+                <w:sz w:val="17"/>
+                <w:szCs w:val="17"/>
+              </w:rPr>
+              <w:t xml:space="preserve">Factibilidad económica</w:t>
+            </w:r>
+          </w:p>
+        </w:tc>
+        <w:tc>
+          <w:tcPr>
+            <w:tcW w:w="2600" w:type="dxa"/>
+            <w:tcMar>
+              <w:top w:w="70" w:type="dxa"/>
+              <w:left w:w="110" w:type="dxa"/>
+              <w:bottom w:w="70" w:type="dxa"/>
+              <w:right w:w="110" w:type="dxa"/>
+            </w:tcMar>
+            <w:vAlign w:val="center"/>
+          </w:tcPr>
+          <w:p>
+            <w:pPr>
+              <w:spacing w:after="0" w:line="240" w:lineRule="auto"/>
+              <w:jc w:val="left"/>
+            </w:pPr>
+            <w:r>
+              <w:rPr>
+                <w:rFonts w:ascii="Arial" w:hAnsi="Arial" w:cs="Arial"/>
+                <w:sz w:val="17"/>
+                <w:szCs w:val="17"/>
+              </w:rPr>
+              <w:t xml:space="preserve">Alta</w:t>
             </w:r>
           </w:p>
         </w:tc>
@@ -2906,11 +2599,12 @@
           <w:tcPr>
             <w:tcW w:w="2700" w:type="dxa"/>
             <w:tcMar>
-              <w:top w:w="40" w:type="dxa"/>
-              <w:left w:w="80" w:type="dxa"/>
-              <w:bottom w:w="40" w:type="dxa"/>
-              <w:right w:w="80" w:type="dxa"/>
-            </w:tcMar>
+              <w:top w:w="70" w:type="dxa"/>
+              <w:left w:w="110" w:type="dxa"/>
+              <w:bottom w:w="70" w:type="dxa"/>
+              <w:right w:w="110" w:type="dxa"/>
+            </w:tcMar>
+            <w:vAlign w:val="center"/>
           </w:tcPr>
           <w:p>
             <w:pPr>
@@ -2920,10 +2614,10 @@
             <w:r>
               <w:rPr>
                 <w:rFonts w:ascii="Arial" w:hAnsi="Arial" w:cs="Arial"/>
-                <w:sz w:val="16"/>
-                <w:szCs w:val="16"/>
-              </w:rPr>
-              <w:t xml:space="preserve">Alta: funciona tal como se probó</w:t>
+                <w:sz w:val="17"/>
+                <w:szCs w:val="17"/>
+              </w:rPr>
+              <w:t xml:space="preserve">Alta</w:t>
             </w:r>
           </w:p>
         </w:tc>
@@ -2931,11 +2625,12 @@
           <w:tcPr>
             <w:tcW w:w="2800" w:type="dxa"/>
             <w:tcMar>
-              <w:top w:w="40" w:type="dxa"/>
-              <w:left w:w="80" w:type="dxa"/>
-              <w:bottom w:w="40" w:type="dxa"/>
-              <w:right w:w="80" w:type="dxa"/>
-            </w:tcMar>
+              <w:top w:w="70" w:type="dxa"/>
+              <w:left w:w="110" w:type="dxa"/>
+              <w:bottom w:w="70" w:type="dxa"/>
+              <w:right w:w="110" w:type="dxa"/>
+            </w:tcMar>
+            <w:vAlign w:val="center"/>
           </w:tcPr>
           <w:p>
             <w:pPr>
@@ -2945,35 +2640,10 @@
             <w:r>
               <w:rPr>
                 <w:rFonts w:ascii="Arial" w:hAnsi="Arial" w:cs="Arial"/>
-                <w:sz w:val="16"/>
-                <w:szCs w:val="16"/>
-              </w:rPr>
-              <w:t xml:space="preserve">Alta/media: ajustar ubicación y lógica</w:t>
-            </w:r>
-          </w:p>
-        </w:tc>
-        <w:tc>
-          <w:tcPr>
-            <w:tcW w:w="2900" w:type="dxa"/>
-            <w:tcMar>
-              <w:top w:w="40" w:type="dxa"/>
-              <w:left w:w="80" w:type="dxa"/>
-              <w:bottom w:w="40" w:type="dxa"/>
-              <w:right w:w="80" w:type="dxa"/>
-            </w:tcMar>
-          </w:tcPr>
-          <w:p>
-            <w:pPr>
-              <w:spacing w:after="0" w:line="240" w:lineRule="auto"/>
-              <w:jc w:val="left"/>
-            </w:pPr>
-            <w:r>
-              <w:rPr>
-                <w:rFonts w:ascii="Arial" w:hAnsi="Arial" w:cs="Arial"/>
-                <w:sz w:val="16"/>
-                <w:szCs w:val="16"/>
-              </w:rPr>
-              <w:t xml:space="preserve">Media: requiere carcasa IP, 24 V con respaldo, 4G</w:t>
+                <w:sz w:val="17"/>
+                <w:szCs w:val="17"/>
+              </w:rPr>
+              <w:t xml:space="preserve">Media-alta</w:t>
             </w:r>
           </w:p>
         </w:tc>
@@ -2984,13 +2654,14 @@
         </w:trPr>
         <w:tc>
           <w:tcPr>
-            <w:tcW w:w="2100" w:type="dxa"/>
-            <w:tcMar>
-              <w:top w:w="40" w:type="dxa"/>
-              <w:left w:w="80" w:type="dxa"/>
-              <w:bottom w:w="40" w:type="dxa"/>
-              <w:right w:w="80" w:type="dxa"/>
-            </w:tcMar>
+            <w:tcW w:w="2400" w:type="dxa"/>
+            <w:tcMar>
+              <w:top w:w="70" w:type="dxa"/>
+              <w:left w:w="110" w:type="dxa"/>
+              <w:bottom w:w="70" w:type="dxa"/>
+              <w:right w:w="110" w:type="dxa"/>
+            </w:tcMar>
+            <w:vAlign w:val="center"/>
           </w:tcPr>
           <w:p>
             <w:pPr>
@@ -3000,10 +2671,36 @@
             <w:r>
               <w:rPr>
                 <w:rFonts w:ascii="Arial" w:hAnsi="Arial" w:cs="Arial"/>
-                <w:sz w:val="16"/>
-                <w:szCs w:val="16"/>
-              </w:rPr>
-              <w:t xml:space="preserve">Factibilidad económica</w:t>
+                <w:sz w:val="17"/>
+                <w:szCs w:val="17"/>
+              </w:rPr>
+              <w:t xml:space="preserve">Principal limitación</w:t>
+            </w:r>
+          </w:p>
+        </w:tc>
+        <w:tc>
+          <w:tcPr>
+            <w:tcW w:w="2600" w:type="dxa"/>
+            <w:tcMar>
+              <w:top w:w="70" w:type="dxa"/>
+              <w:left w:w="110" w:type="dxa"/>
+              <w:bottom w:w="70" w:type="dxa"/>
+              <w:right w:w="110" w:type="dxa"/>
+            </w:tcMar>
+            <w:vAlign w:val="center"/>
+          </w:tcPr>
+          <w:p>
+            <w:pPr>
+              <w:spacing w:after="0" w:line="240" w:lineRule="auto"/>
+              <w:jc w:val="left"/>
+            </w:pPr>
+            <w:r>
+              <w:rPr>
+                <w:rFonts w:ascii="Arial" w:hAnsi="Arial" w:cs="Arial"/>
+                <w:sz w:val="17"/>
+                <w:szCs w:val="17"/>
+              </w:rPr>
+              <w:t xml:space="preserve">Cortes de luz o de WiFi</w:t>
             </w:r>
           </w:p>
         </w:tc>
@@ -3011,11 +2708,12 @@
           <w:tcPr>
             <w:tcW w:w="2700" w:type="dxa"/>
             <w:tcMar>
-              <w:top w:w="40" w:type="dxa"/>
-              <w:left w:w="80" w:type="dxa"/>
-              <w:bottom w:w="40" w:type="dxa"/>
-              <w:right w:w="80" w:type="dxa"/>
-            </w:tcMar>
+              <w:top w:w="70" w:type="dxa"/>
+              <w:left w:w="110" w:type="dxa"/>
+              <w:bottom w:w="70" w:type="dxa"/>
+              <w:right w:w="110" w:type="dxa"/>
+            </w:tcMar>
+            <w:vAlign w:val="center"/>
           </w:tcPr>
           <w:p>
             <w:pPr>
@@ -3025,10 +2723,10 @@
             <w:r>
               <w:rPr>
                 <w:rFonts w:ascii="Arial" w:hAnsi="Arial" w:cs="Arial"/>
-                <w:sz w:val="16"/>
-                <w:szCs w:val="16"/>
-              </w:rPr>
-              <w:t xml:space="preserve">Alta</w:t>
+                <w:sz w:val="17"/>
+                <w:szCs w:val="17"/>
+              </w:rPr>
+              <w:t xml:space="preserve">Vitrinas iluminadas de noche</w:t>
             </w:r>
           </w:p>
         </w:tc>
@@ -3036,11 +2734,12 @@
           <w:tcPr>
             <w:tcW w:w="2800" w:type="dxa"/>
             <w:tcMar>
-              <w:top w:w="40" w:type="dxa"/>
-              <w:left w:w="80" w:type="dxa"/>
-              <w:bottom w:w="40" w:type="dxa"/>
-              <w:right w:w="80" w:type="dxa"/>
-            </w:tcMar>
+              <w:top w:w="70" w:type="dxa"/>
+              <w:left w:w="110" w:type="dxa"/>
+              <w:bottom w:w="70" w:type="dxa"/>
+              <w:right w:w="110" w:type="dxa"/>
+            </w:tcMar>
+            <w:vAlign w:val="center"/>
           </w:tcPr>
           <w:p>
             <w:pPr>
@@ -3050,35 +2749,10 @@
             <w:r>
               <w:rPr>
                 <w:rFonts w:ascii="Arial" w:hAnsi="Arial" w:cs="Arial"/>
-                <w:sz w:val="16"/>
-                <w:szCs w:val="16"/>
-              </w:rPr>
-              <w:t xml:space="preserve">Alta</w:t>
-            </w:r>
-          </w:p>
-        </w:tc>
-        <w:tc>
-          <w:tcPr>
-            <w:tcW w:w="2900" w:type="dxa"/>
-            <w:tcMar>
-              <w:top w:w="40" w:type="dxa"/>
-              <w:left w:w="80" w:type="dxa"/>
-              <w:bottom w:w="40" w:type="dxa"/>
-              <w:right w:w="80" w:type="dxa"/>
-            </w:tcMar>
-          </w:tcPr>
-          <w:p>
-            <w:pPr>
-              <w:spacing w:after="0" w:line="240" w:lineRule="auto"/>
-              <w:jc w:val="left"/>
-            </w:pPr>
-            <w:r>
-              <w:rPr>
-                <w:rFonts w:ascii="Arial" w:hAnsi="Arial" w:cs="Arial"/>
-                <w:sz w:val="16"/>
-                <w:szCs w:val="16"/>
-              </w:rPr>
-              <w:t xml:space="preserve">Media-alta (≈ $150.000–250.000 por nodo)</w:t>
+                <w:sz w:val="17"/>
+                <w:szCs w:val="17"/>
+              </w:rPr>
+              <w:t xml:space="preserve">Poca cobertura WiFi y ruido de máquinas</w:t>
             </w:r>
           </w:p>
         </w:tc>
@@ -3089,13 +2763,14 @@
         </w:trPr>
         <w:tc>
           <w:tcPr>
-            <w:tcW w:w="2100" w:type="dxa"/>
-            <w:tcMar>
-              <w:top w:w="40" w:type="dxa"/>
-              <w:left w:w="80" w:type="dxa"/>
-              <w:bottom w:w="40" w:type="dxa"/>
-              <w:right w:w="80" w:type="dxa"/>
-            </w:tcMar>
+            <w:tcW w:w="2400" w:type="dxa"/>
+            <w:tcMar>
+              <w:top w:w="70" w:type="dxa"/>
+              <w:left w:w="110" w:type="dxa"/>
+              <w:bottom w:w="70" w:type="dxa"/>
+              <w:right w:w="110" w:type="dxa"/>
+            </w:tcMar>
+            <w:vAlign w:val="center"/>
           </w:tcPr>
           <w:p>
             <w:pPr>
@@ -3105,10 +2780,36 @@
             <w:r>
               <w:rPr>
                 <w:rFonts w:ascii="Arial" w:hAnsi="Arial" w:cs="Arial"/>
-                <w:sz w:val="16"/>
-                <w:szCs w:val="16"/>
-              </w:rPr>
-              <w:t xml:space="preserve">Limitación principal</w:t>
+                <w:sz w:val="17"/>
+                <w:szCs w:val="17"/>
+              </w:rPr>
+              <w:t xml:space="preserve">Recomendación</w:t>
+            </w:r>
+          </w:p>
+        </w:tc>
+        <w:tc>
+          <w:tcPr>
+            <w:tcW w:w="2600" w:type="dxa"/>
+            <w:tcMar>
+              <w:top w:w="70" w:type="dxa"/>
+              <w:left w:w="110" w:type="dxa"/>
+              <w:bottom w:w="70" w:type="dxa"/>
+              <w:right w:w="110" w:type="dxa"/>
+            </w:tcMar>
+            <w:vAlign w:val="center"/>
+          </w:tcPr>
+          <w:p>
+            <w:pPr>
+              <w:spacing w:after="0" w:line="240" w:lineRule="auto"/>
+              <w:jc w:val="left"/>
+            </w:pPr>
+            <w:r>
+              <w:rPr>
+                <w:rFonts w:ascii="Arial" w:hAnsi="Arial" w:cs="Arial"/>
+                <w:sz w:val="17"/>
+                <w:szCs w:val="17"/>
+              </w:rPr>
+              <w:t xml:space="preserve">Batería de respaldo y sirena local</w:t>
             </w:r>
           </w:p>
         </w:tc>
@@ -3116,11 +2817,12 @@
           <w:tcPr>
             <w:tcW w:w="2700" w:type="dxa"/>
             <w:tcMar>
-              <w:top w:w="40" w:type="dxa"/>
-              <w:left w:w="80" w:type="dxa"/>
-              <w:bottom w:w="40" w:type="dxa"/>
-              <w:right w:w="80" w:type="dxa"/>
-            </w:tcMar>
+              <w:top w:w="70" w:type="dxa"/>
+              <w:left w:w="110" w:type="dxa"/>
+              <w:bottom w:w="70" w:type="dxa"/>
+              <w:right w:w="110" w:type="dxa"/>
+            </w:tcMar>
+            <w:vAlign w:val="center"/>
           </w:tcPr>
           <w:p>
             <w:pPr>
@@ -3130,10 +2832,10 @@
             <w:r>
               <w:rPr>
                 <w:rFonts w:ascii="Arial" w:hAnsi="Arial" w:cs="Arial"/>
-                <w:sz w:val="16"/>
-                <w:szCs w:val="16"/>
-              </w:rPr>
-              <w:t xml:space="preserve">Corte de energía o WiFi</w:t>
+                <w:sz w:val="17"/>
+                <w:szCs w:val="17"/>
+              </w:rPr>
+              <w:t xml:space="preserve">Ajustar la lógica a 2 de 3 condiciones</w:t>
             </w:r>
           </w:p>
         </w:tc>
@@ -3141,11 +2843,12 @@
           <w:tcPr>
             <w:tcW w:w="2800" w:type="dxa"/>
             <w:tcMar>
-              <w:top w:w="40" w:type="dxa"/>
-              <w:left w:w="80" w:type="dxa"/>
-              <w:bottom w:w="40" w:type="dxa"/>
-              <w:right w:w="80" w:type="dxa"/>
-            </w:tcMar>
+              <w:top w:w="70" w:type="dxa"/>
+              <w:left w:w="110" w:type="dxa"/>
+              <w:bottom w:w="70" w:type="dxa"/>
+              <w:right w:w="110" w:type="dxa"/>
+            </w:tcMar>
+            <w:vAlign w:val="center"/>
           </w:tcPr>
           <w:p>
             <w:pPr>
@@ -3155,140 +2858,10 @@
             <w:r>
               <w:rPr>
                 <w:rFonts w:ascii="Arial" w:hAnsi="Arial" w:cs="Arial"/>
-                <w:sz w:val="16"/>
-                <w:szCs w:val="16"/>
-              </w:rPr>
-              <w:t xml:space="preserve">Luz de vitrinas impide condición de oscuridad</w:t>
-            </w:r>
-          </w:p>
-        </w:tc>
-        <w:tc>
-          <w:tcPr>
-            <w:tcW w:w="2900" w:type="dxa"/>
-            <w:tcMar>
-              <w:top w:w="40" w:type="dxa"/>
-              <w:left w:w="80" w:type="dxa"/>
-              <w:bottom w:w="40" w:type="dxa"/>
-              <w:right w:w="80" w:type="dxa"/>
-            </w:tcMar>
-          </w:tcPr>
-          <w:p>
-            <w:pPr>
-              <w:spacing w:after="0" w:line="240" w:lineRule="auto"/>
-              <w:jc w:val="left"/>
-            </w:pPr>
-            <w:r>
-              <w:rPr>
-                <w:rFonts w:ascii="Arial" w:hAnsi="Arial" w:cs="Arial"/>
-                <w:sz w:val="16"/>
-                <w:szCs w:val="16"/>
-              </w:rPr>
-              <w:t xml:space="preserve">Cobertura WiFi y falsas alarmas por ruido</w:t>
-            </w:r>
-          </w:p>
-        </w:tc>
-      </w:tr>
-      <w:tr>
-        <w:trPr>
-          <w:cantSplit/>
-        </w:trPr>
-        <w:tc>
-          <w:tcPr>
-            <w:tcW w:w="2100" w:type="dxa"/>
-            <w:tcMar>
-              <w:top w:w="40" w:type="dxa"/>
-              <w:left w:w="80" w:type="dxa"/>
-              <w:bottom w:w="40" w:type="dxa"/>
-              <w:right w:w="80" w:type="dxa"/>
-            </w:tcMar>
-          </w:tcPr>
-          <w:p>
-            <w:pPr>
-              <w:spacing w:after="0" w:line="240" w:lineRule="auto"/>
-              <w:jc w:val="left"/>
-            </w:pPr>
-            <w:r>
-              <w:rPr>
-                <w:rFonts w:ascii="Arial" w:hAnsi="Arial" w:cs="Arial"/>
-                <w:sz w:val="16"/>
-                <w:szCs w:val="16"/>
-              </w:rPr>
-              <w:t xml:space="preserve">Recomendación</w:t>
-            </w:r>
-          </w:p>
-        </w:tc>
-        <w:tc>
-          <w:tcPr>
-            <w:tcW w:w="2700" w:type="dxa"/>
-            <w:tcMar>
-              <w:top w:w="40" w:type="dxa"/>
-              <w:left w:w="80" w:type="dxa"/>
-              <w:bottom w:w="40" w:type="dxa"/>
-              <w:right w:w="80" w:type="dxa"/>
-            </w:tcMar>
-          </w:tcPr>
-          <w:p>
-            <w:pPr>
-              <w:spacing w:after="0" w:line="240" w:lineRule="auto"/>
-              <w:jc w:val="left"/>
-            </w:pPr>
-            <w:r>
-              <w:rPr>
-                <w:rFonts w:ascii="Arial" w:hAnsi="Arial" w:cs="Arial"/>
-                <w:sz w:val="16"/>
-                <w:szCs w:val="16"/>
-              </w:rPr>
-              <w:t xml:space="preserve">Batería de respaldo y buzzer local</w:t>
-            </w:r>
-          </w:p>
-        </w:tc>
-        <w:tc>
-          <w:tcPr>
-            <w:tcW w:w="2800" w:type="dxa"/>
-            <w:tcMar>
-              <w:top w:w="40" w:type="dxa"/>
-              <w:left w:w="80" w:type="dxa"/>
-              <w:bottom w:w="40" w:type="dxa"/>
-              <w:right w:w="80" w:type="dxa"/>
-            </w:tcMar>
-          </w:tcPr>
-          <w:p>
-            <w:pPr>
-              <w:spacing w:after="0" w:line="240" w:lineRule="auto"/>
-              <w:jc w:val="left"/>
-            </w:pPr>
-            <w:r>
-              <w:rPr>
-                <w:rFonts w:ascii="Arial" w:hAnsi="Arial" w:cs="Arial"/>
-                <w:sz w:val="16"/>
-                <w:szCs w:val="16"/>
-              </w:rPr>
-              <w:t xml:space="preserve">Lógica 2 de 3 condiciones y plan pagado del servidor</w:t>
-            </w:r>
-          </w:p>
-        </w:tc>
-        <w:tc>
-          <w:tcPr>
-            <w:tcW w:w="2900" w:type="dxa"/>
-            <w:tcMar>
-              <w:top w:w="40" w:type="dxa"/>
-              <w:left w:w="80" w:type="dxa"/>
-              <w:bottom w:w="40" w:type="dxa"/>
-              <w:right w:w="80" w:type="dxa"/>
-            </w:tcMar>
-          </w:tcPr>
-          <w:p>
-            <w:pPr>
-              <w:spacing w:after="0" w:line="240" w:lineRule="auto"/>
-              <w:jc w:val="left"/>
-            </w:pPr>
-            <w:r>
-              <w:rPr>
-                <w:rFonts w:ascii="Arial" w:hAnsi="Arial" w:cs="Arial"/>
-                <w:sz w:val="16"/>
-                <w:szCs w:val="16"/>
-              </w:rPr>
-              <w:t xml:space="preserve">VLAN IoT, sensores industriales, piloto previo</w:t>
+                <w:sz w:val="17"/>
+                <w:szCs w:val="17"/>
+              </w:rPr>
+              <w:t xml:space="preserve">Equipos industriales, red separada y prueba piloto</w:t>
             </w:r>
           </w:p>
         </w:tc>
@@ -3296,14 +2869,22 @@
     </w:tbl>
     <w:p>
       <w:pPr>
-        <w:spacing w:after="60"/>
-      </w:pPr>
-    </w:p>
-    <w:p>
-      <w:pPr>
-        <w:spacing w:after="120" w:line="240" w:lineRule="auto"/>
+        <w:spacing w:after="120"/>
+      </w:pPr>
+    </w:p>
+    <w:p>
+      <w:pPr>
+        <w:spacing w:after="200" w:line="276" w:lineRule="auto"/>
         <w:jc w:val="both"/>
       </w:pPr>
+      <w:r>
+        <w:rPr>
+          <w:rFonts w:ascii="Arial" w:hAnsi="Arial" w:cs="Arial"/>
+          <w:sz w:val="22"/>
+          <w:szCs w:val="22"/>
+        </w:rPr>
+        <w:t xml:space="preserve">En lo económico, cada equipo cuesta alrededor de </w:t>
+      </w:r>
       <w:r>
         <w:rPr>
           <w:rFonts w:ascii="Arial" w:hAnsi="Arial" w:cs="Arial"/>
@@ -3312,15 +2893,29 @@
           <w:sz w:val="22"/>
           <w:szCs w:val="22"/>
         </w:rPr>
-        <w:t xml:space="preserve">Costos:</w:t>
-      </w:r>
-      <w:r>
-        <w:rPr>
-          <w:rFonts w:ascii="Arial" w:hAnsi="Arial" w:cs="Arial"/>
-          <w:sz w:val="22"/>
-          <w:szCs w:val="22"/>
-        </w:rPr>
-        <w:t xml:space="preserve"> el hardware por nodo cuesta ≈ </w:t>
+        <w:t xml:space="preserve">$52.500</w:t>
+      </w:r>
+      <w:r>
+        <w:rPr>
+          <w:rFonts w:ascii="Arial" w:hAnsi="Arial" w:cs="Arial"/>
+          <w:sz w:val="22"/>
+          <w:szCs w:val="22"/>
+        </w:rPr>
+        <w:t xml:space="preserve"> en hardware y su funcionamiento puede ser gratuito o costar cerca de USD 7 al mes, más el valor de cada SMS. Esto es bastante menos que una alarma con monitoreo, que suele costar entre $20.000 y $35.000 mensuales. En una bodega el costo sube a unos $150.000 a $250.000 por equipo, porque se necesitan carcasas resistentes y respaldo de energía.</w:t>
+      </w:r>
+    </w:p>
+    <w:p>
+      <w:pPr>
+        <w:spacing w:after="200" w:line="276" w:lineRule="auto"/>
+        <w:jc w:val="both"/>
+      </w:pPr>
+      <w:r>
+        <w:rPr>
+          <w:rFonts w:ascii="Arial" w:hAnsi="Arial" w:cs="Arial"/>
+          <w:sz w:val="22"/>
+          <w:szCs w:val="22"/>
+        </w:rPr>
+        <w:t xml:space="preserve">Respecto a los estándares OT, el proyecto sigue buenas prácticas de la norma </w:t>
       </w:r>
       <w:r>
         <w:rPr>
@@ -3330,15 +2925,15 @@
           <w:sz w:val="22"/>
           <w:szCs w:val="22"/>
         </w:rPr>
-        <w:t xml:space="preserve">$52.500</w:t>
-      </w:r>
-      <w:r>
-        <w:rPr>
-          <w:rFonts w:ascii="Arial" w:hAnsi="Arial" w:cs="Arial"/>
-          <w:sz w:val="22"/>
-          <w:szCs w:val="22"/>
-        </w:rPr>
-        <w:t xml:space="preserve"> (Arduino $32.000, sensores $6.500, cables, fuente y carcasa $14.000; el celular-cámara puede ser reutilizado). La operación va de </w:t>
+        <w:t xml:space="preserve">IEC 62443</w:t>
+      </w:r>
+      <w:r>
+        <w:rPr>
+          <w:rFonts w:ascii="Arial" w:hAnsi="Arial" w:cs="Arial"/>
+          <w:sz w:val="22"/>
+          <w:szCs w:val="22"/>
+        </w:rPr>
+        <w:t xml:space="preserve"> (comunicación cifrada y control de acceso) y del modelo </w:t>
       </w:r>
       <w:r>
         <w:rPr>
@@ -3348,22 +2943,16 @@
           <w:sz w:val="22"/>
           <w:szCs w:val="22"/>
         </w:rPr>
-        <w:t xml:space="preserve">$0 a ≈ USD 7 al mes</w:t>
-      </w:r>
-      <w:r>
-        <w:rPr>
-          <w:rFonts w:ascii="Arial" w:hAnsi="Arial" w:cs="Arial"/>
-          <w:sz w:val="22"/>
-          <w:szCs w:val="22"/>
-        </w:rPr>
-        <w:t xml:space="preserve"> (Render, MongoDB Atlas gratuito, push sin costo) más ≈ USD 0,05–0,10 por SMS, frente a $20.000–35.000 mensuales de una alarma monitoreada.</w:t>
-      </w:r>
-    </w:p>
-    <w:p>
-      <w:pPr>
-        <w:spacing w:after="120" w:line="240" w:lineRule="auto"/>
-        <w:jc w:val="both"/>
-      </w:pPr>
+        <w:t xml:space="preserve">ISA-95</w:t>
+      </w:r>
+      <w:r>
+        <w:rPr>
+          <w:rFonts w:ascii="Arial" w:hAnsi="Arial" w:cs="Arial"/>
+          <w:sz w:val="22"/>
+          <w:szCs w:val="22"/>
+        </w:rPr>
+        <w:t xml:space="preserve">, ya que la detección se hace en el propio Arduino y no depende de Internet. También considera la </w:t>
+      </w:r>
       <w:r>
         <w:rPr>
           <w:rFonts w:ascii="Arial" w:hAnsi="Arial" w:cs="Arial"/>
@@ -3372,60 +2961,6 @@
           <w:sz w:val="22"/>
           <w:szCs w:val="22"/>
         </w:rPr>
-        <w:t xml:space="preserve">Estándares OT:</w:t>
-      </w:r>
-      <w:r>
-        <w:rPr>
-          <w:rFonts w:ascii="Arial" w:hAnsi="Arial" w:cs="Arial"/>
-          <w:sz w:val="22"/>
-          <w:szCs w:val="22"/>
-        </w:rPr>
-        <w:t xml:space="preserve"> el proyecto se alinea con </w:t>
-      </w:r>
-      <w:r>
-        <w:rPr>
-          <w:rFonts w:ascii="Arial" w:hAnsi="Arial" w:cs="Arial"/>
-          <w:b/>
-          <w:bCs/>
-          <w:sz w:val="22"/>
-          <w:szCs w:val="22"/>
-        </w:rPr>
-        <w:t xml:space="preserve">IEC 62443</w:t>
-      </w:r>
-      <w:r>
-        <w:rPr>
-          <w:rFonts w:ascii="Arial" w:hAnsi="Arial" w:cs="Arial"/>
-          <w:sz w:val="22"/>
-          <w:szCs w:val="22"/>
-        </w:rPr>
-        <w:t xml:space="preserve"> (comunicaciones cifradas, control de acceso, secretos protegidos; brecha: autenticación del dispositivo y zonas), con el modelo </w:t>
-      </w:r>
-      <w:r>
-        <w:rPr>
-          <w:rFonts w:ascii="Arial" w:hAnsi="Arial" w:cs="Arial"/>
-          <w:b/>
-          <w:bCs/>
-          <w:sz w:val="22"/>
-          <w:szCs w:val="22"/>
-        </w:rPr>
-        <w:t xml:space="preserve">ISA-95/Purdue</w:t>
-      </w:r>
-      <w:r>
-        <w:rPr>
-          <w:rFonts w:ascii="Arial" w:hAnsi="Arial" w:cs="Arial"/>
-          <w:sz w:val="22"/>
-          <w:szCs w:val="22"/>
-        </w:rPr>
-        <w:t xml:space="preserve"> (sensores en nivel 0, Arduino controla localmente en nivel 1, supervisión en nivel 2, nube en nivel 4; la detección no depende de la nube) y con la </w:t>
-      </w:r>
-      <w:r>
-        <w:rPr>
-          <w:rFonts w:ascii="Arial" w:hAnsi="Arial" w:cs="Arial"/>
-          <w:b/>
-          <w:bCs/>
-          <w:sz w:val="22"/>
-          <w:szCs w:val="22"/>
-        </w:rPr>
         <w:t xml:space="preserve">Ley 21.719</w:t>
       </w:r>
       <w:r>
@@ -3434,116 +2969,75 @@
           <w:sz w:val="22"/>
           <w:szCs w:val="22"/>
         </w:rPr>
-        <w:t xml:space="preserve"> de datos personales (biometría con consentimiento y opción de eliminación). Para industria se requiere grado de protección </w:t>
-      </w:r>
-      <w:r>
-        <w:rPr>
-          <w:rFonts w:ascii="Arial" w:hAnsi="Arial" w:cs="Arial"/>
-          <w:b/>
-          <w:bCs/>
-          <w:sz w:val="22"/>
-          <w:szCs w:val="22"/>
-        </w:rPr>
-        <w:t xml:space="preserve">IEC 60529 (IP54–IP65)</w:t>
-      </w:r>
-      <w:r>
-        <w:rPr>
-          <w:rFonts w:ascii="Arial" w:hAnsi="Arial" w:cs="Arial"/>
-          <w:sz w:val="22"/>
-          <w:szCs w:val="22"/>
-        </w:rPr>
-        <w:t xml:space="preserve">.</w:t>
-      </w:r>
-    </w:p>
-    <w:p>
-      <w:pPr>
-        <w:spacing w:after="120" w:line="240" w:lineRule="auto"/>
+        <w:t xml:space="preserve"> de datos personales, pues solo se guardan los datos del rostro con consentimiento. Las principales limitaciones son la dependencia de la electricidad y de Internet, y que la alarma exige las tres condiciones a la vez; ambas se pueden resolver con batería de respaldo, una sirena local y una lógica configurable.</w:t>
+      </w:r>
+    </w:p>
+    <w:p>
+      <w:r>
+        <w:br w:type="page"/>
+      </w:r>
+    </w:p>
+    <w:p>
+      <w:pPr>
+        <w:pStyle w:val="Ttulo1"/>
+      </w:pPr>
+      <w:bookmarkStart w:id="7" w:name="_Toc900007"/>
+      <w:r>
+        <w:t xml:space="preserve">3. Conclusión</w:t>
+      </w:r>
+      <w:bookmarkEnd w:id="7"/>
+    </w:p>
+    <w:p>
+      <w:pPr>
+        <w:spacing w:after="200" w:line="276" w:lineRule="auto"/>
         <w:jc w:val="both"/>
       </w:pPr>
       <w:r>
         <w:rPr>
           <w:rFonts w:ascii="Arial" w:hAnsi="Arial" w:cs="Arial"/>
-          <w:b/>
-          <w:bCs/>
-          <w:sz w:val="22"/>
-          <w:szCs w:val="22"/>
-        </w:rPr>
-        <w:t xml:space="preserve">Limitaciones generales y mitigación:</w:t>
-      </w:r>
-      <w:r>
-        <w:rPr>
-          <w:rFonts w:ascii="Arial" w:hAnsi="Arial" w:cs="Arial"/>
-          <w:sz w:val="22"/>
-          <w:szCs w:val="22"/>
-        </w:rPr>
-        <w:t xml:space="preserve"> dependencia de energía e Internet (batería, alarma local y 4G), lógica de 3 condiciones (lógica configurable y sensor PIR), alcance de 50 cm del HC-SR04 (más nodos), suspensión del plan gratuito del servidor (plan pagado) e historial en memoria (persistirlo en la base de datos). </w:t>
-      </w:r>
-      <w:r>
-        <w:rPr>
-          <w:rFonts w:ascii="Arial" w:hAnsi="Arial" w:cs="Arial"/>
-          <w:b/>
-          <w:bCs/>
-          <w:sz w:val="22"/>
-          <w:szCs w:val="22"/>
-        </w:rPr>
-        <w:t xml:space="preserve">Validación en campo propuesta:</w:t>
-      </w:r>
-      <w:r>
-        <w:rPr>
-          <w:rFonts w:ascii="Arial" w:hAnsi="Arial" w:cs="Arial"/>
-          <w:sz w:val="22"/>
-          <w:szCs w:val="22"/>
-        </w:rPr>
-        <w:t xml:space="preserve"> piloto de 72 h con ≤ 1 falsa alarma diaria, 10 intrusiones simuladas con detección ≥ 9/10 y aviso &lt; 10 s, RSSI mejor que −70 dBm y reconexión tras cortes en &lt; 2 min.</w:t>
+          <w:sz w:val="22"/>
+          <w:szCs w:val="22"/>
+        </w:rPr>
+        <w:t xml:space="preserve">Con este proyecto se comprobó que es posible construir un sistema antirrobo funcional y de bajo costo uniendo un Arduino UNO R4 WiFi, sensores comunes y servicios en la nube. La placa elegida permitió conectar todos los sensores sin adaptadores y enviar la información de forma segura, y la decisión de exigir tres condiciones al mismo tiempo, junto con la calibración automática, ayudó mucho a evitar falsas alarmas.</w:t>
+      </w:r>
+    </w:p>
+    <w:p>
+      <w:pPr>
+        <w:spacing w:after="200" w:line="276" w:lineRule="auto"/>
+        <w:jc w:val="both"/>
+      </w:pPr>
+      <w:r>
+        <w:rPr>
+          <w:rFonts w:ascii="Arial" w:hAnsi="Arial" w:cs="Arial"/>
+          <w:sz w:val="22"/>
+          <w:szCs w:val="22"/>
+        </w:rPr>
+        <w:t xml:space="preserve">La aplicación cumplió con lo esperado: muestra los datos en tiempo real, guarda un historial con fotos, envía avisos por SMS y al teléfono, y permite ver la cámara y reconocer rostros. Durante el desarrollo también aparecieron problemas, como el bloqueo que causaba la pantalla LCD o las lecturas distintas entre sensores, y resolverlos fue parte importante del aprendizaje.</w:t>
+      </w:r>
+    </w:p>
+    <w:p>
+      <w:pPr>
+        <w:spacing w:after="200" w:line="276" w:lineRule="auto"/>
+        <w:jc w:val="both"/>
+      </w:pPr>
+      <w:r>
+        <w:rPr>
+          <w:rFonts w:ascii="Arial" w:hAnsi="Arial" w:cs="Arial"/>
+          <w:sz w:val="22"/>
+          <w:szCs w:val="22"/>
+        </w:rPr>
+        <w:t xml:space="preserve">Del análisis de entornos se concluye que el sistema es factible en viviendas y pequeños comercios, principalmente por su bajo costo frente a una alarma tradicional. En una bodega o industria también es viable, pero necesitaría equipos más resistentes, respaldo de energía y comunicación, y mayor seguridad en la red. Como trabajo futuro quedan agregar una sirena física, soportar varios dispositivos y llevar la comunicación a protocolos industriales como MQTT.</w:t>
+      </w:r>
+    </w:p>
+    <w:p>
+      <w:r>
+        <w:br w:type="page"/>
       </w:r>
     </w:p>
     <w:p>
       <w:pPr>
         <w:pStyle w:val="Ttulo1"/>
       </w:pPr>
-      <w:bookmarkStart w:id="7" w:name="_Toc900007"/>
-      <w:r>
-        <w:t xml:space="preserve">3. Conclusión</w:t>
-      </w:r>
-      <w:bookmarkEnd w:id="7"/>
-    </w:p>
-    <w:p>
-      <w:pPr>
-        <w:spacing w:after="120" w:line="240" w:lineRule="auto"/>
-        <w:jc w:val="both"/>
-      </w:pPr>
-      <w:r>
-        <w:rPr>
-          <w:rFonts w:ascii="Arial" w:hAnsi="Arial" w:cs="Arial"/>
-          <w:sz w:val="22"/>
-          <w:szCs w:val="22"/>
-        </w:rPr>
-        <w:t xml:space="preserve">El proyecto demostró que es factible construir un sistema antirrobo IoT funcional y de bajo costo integrando un Arduino UNO R4 WiFi, sensores de uso general y servicios en la nube. La placa elegida permitió conectar todos los sensores sin adaptadores y comunicarse de forma cifrada con el servidor, mientras que la combinación de tres condiciones, la confirmación de tres lecturas y la calibración automática de umbrales redujeron las falsas alarmas y permitieron usar distintos módulos sin reprogramar.</w:t>
-      </w:r>
-    </w:p>
-    <w:p>
-      <w:pPr>
-        <w:spacing w:after="120" w:line="240" w:lineRule="auto"/>
-        <w:jc w:val="both"/>
-      </w:pPr>
-      <w:r>
-        <w:rPr>
-          <w:rFonts w:ascii="Arial" w:hAnsi="Arial" w:cs="Arial"/>
-          <w:sz w:val="22"/>
-          <w:szCs w:val="22"/>
-        </w:rPr>
-        <w:t xml:space="preserve">La aplicación cumplió los requisitos planteados: monitoreo en tiempo real, historial con fotografía, avisos por SMS y push, cámara en vivo y reconocimiento facial, protegidos con HTTPS, bcrypt y JWT. El análisis concluyó que la solución es plenamente factible en viviendas y pequeños comercios por su bajo costo, y viable en recintos industriales siempre que se incorporen hardware de grado industrial, respaldo de energía y comunicaciones, autenticación de dispositivos y un mayor alineamiento con IEC 62443. Como trabajo futuro quedan la alarma física local, el soporte de múltiples nodos y la migración a MQTT.</w:t>
-      </w:r>
-    </w:p>
-    <w:p>
-      <w:r>
-        <w:br w:type="page"/>
-      </w:r>
-    </w:p>
-    <w:p>
-      <w:pPr>
-        <w:pStyle w:val="Ttulo1"/>
-      </w:pPr>
       <w:bookmarkStart w:id="8" w:name="_Toc900008"/>
       <w:r>
         <w:t xml:space="preserve">Referencias bibliográficas</w:t>
@@ -3552,15 +3046,15 @@
     </w:p>
     <w:p>
       <w:pPr>
-        <w:spacing w:after="60" w:line="240" w:lineRule="auto"/>
+        <w:spacing w:after="160" w:line="276" w:lineRule="auto"/>
         <w:ind w:left="567" w:hanging="567"/>
         <w:jc w:val="left"/>
       </w:pPr>
       <w:r>
         <w:rPr>
           <w:rFonts w:ascii="Arial" w:hAnsi="Arial" w:cs="Arial"/>
-          <w:sz w:val="20"/>
-          <w:szCs w:val="20"/>
+          <w:sz w:val="22"/>
+          <w:szCs w:val="22"/>
         </w:rPr>
         <w:t xml:space="preserve">Arduino. (2023). </w:t>
       </w:r>
@@ -3568,31 +3062,31 @@
         <w:rPr>
           <w:rFonts w:ascii="Arial" w:hAnsi="Arial" w:cs="Arial"/>
           <w:i/>
-          <w:sz w:val="20"/>
-          <w:szCs w:val="20"/>
+          <w:sz w:val="22"/>
+          <w:szCs w:val="22"/>
         </w:rPr>
         <w:t xml:space="preserve">Arduino UNO R4 WiFi: Product reference manual</w:t>
       </w:r>
       <w:r>
         <w:rPr>
           <w:rFonts w:ascii="Arial" w:hAnsi="Arial" w:cs="Arial"/>
-          <w:sz w:val="20"/>
-          <w:szCs w:val="20"/>
+          <w:sz w:val="22"/>
+          <w:szCs w:val="22"/>
         </w:rPr>
         <w:t xml:space="preserve">. Recuperado de https://docs.arduino.cc/hardware/uno-r4-wifi</w:t>
       </w:r>
     </w:p>
     <w:p>
       <w:pPr>
-        <w:spacing w:after="60" w:line="240" w:lineRule="auto"/>
+        <w:spacing w:after="160" w:line="276" w:lineRule="auto"/>
         <w:ind w:left="567" w:hanging="567"/>
         <w:jc w:val="left"/>
       </w:pPr>
       <w:r>
         <w:rPr>
           <w:rFonts w:ascii="Arial" w:hAnsi="Arial" w:cs="Arial"/>
-          <w:sz w:val="20"/>
-          <w:szCs w:val="20"/>
+          <w:sz w:val="22"/>
+          <w:szCs w:val="22"/>
         </w:rPr>
         <w:t xml:space="preserve">Espressif Systems. (2023). </w:t>
       </w:r>
@@ -3600,31 +3094,31 @@
         <w:rPr>
           <w:rFonts w:ascii="Arial" w:hAnsi="Arial" w:cs="Arial"/>
           <w:i/>
-          <w:sz w:val="20"/>
-          <w:szCs w:val="20"/>
+          <w:sz w:val="22"/>
+          <w:szCs w:val="22"/>
         </w:rPr>
         <w:t xml:space="preserve">ESP32-S3 series datasheet</w:t>
       </w:r>
       <w:r>
         <w:rPr>
           <w:rFonts w:ascii="Arial" w:hAnsi="Arial" w:cs="Arial"/>
-          <w:sz w:val="20"/>
-          <w:szCs w:val="20"/>
+          <w:sz w:val="22"/>
+          <w:szCs w:val="22"/>
         </w:rPr>
         <w:t xml:space="preserve">. Recuperado de https://www.espressif.com</w:t>
       </w:r>
     </w:p>
     <w:p>
       <w:pPr>
-        <w:spacing w:after="60" w:line="240" w:lineRule="auto"/>
+        <w:spacing w:after="160" w:line="276" w:lineRule="auto"/>
         <w:ind w:left="567" w:hanging="567"/>
         <w:jc w:val="left"/>
       </w:pPr>
       <w:r>
         <w:rPr>
           <w:rFonts w:ascii="Arial" w:hAnsi="Arial" w:cs="Arial"/>
-          <w:sz w:val="20"/>
-          <w:szCs w:val="20"/>
+          <w:sz w:val="22"/>
+          <w:szCs w:val="22"/>
         </w:rPr>
         <w:t xml:space="preserve">International Electrotechnical Commission. (2018). </w:t>
       </w:r>
@@ -3632,31 +3126,31 @@
         <w:rPr>
           <w:rFonts w:ascii="Arial" w:hAnsi="Arial" w:cs="Arial"/>
           <w:i/>
-          <w:sz w:val="20"/>
-          <w:szCs w:val="20"/>
+          <w:sz w:val="22"/>
+          <w:szCs w:val="22"/>
         </w:rPr>
         <w:t xml:space="preserve">IEC 62443-3-3: Security for industrial automation and control systems</w:t>
       </w:r>
       <w:r>
         <w:rPr>
           <w:rFonts w:ascii="Arial" w:hAnsi="Arial" w:cs="Arial"/>
-          <w:sz w:val="20"/>
-          <w:szCs w:val="20"/>
+          <w:sz w:val="22"/>
+          <w:szCs w:val="22"/>
         </w:rPr>
         <w:t xml:space="preserve">. Ginebra: IEC.</w:t>
       </w:r>
     </w:p>
     <w:p>
       <w:pPr>
-        <w:spacing w:after="60" w:line="240" w:lineRule="auto"/>
+        <w:spacing w:after="160" w:line="276" w:lineRule="auto"/>
         <w:ind w:left="567" w:hanging="567"/>
         <w:jc w:val="left"/>
       </w:pPr>
       <w:r>
         <w:rPr>
           <w:rFonts w:ascii="Arial" w:hAnsi="Arial" w:cs="Arial"/>
-          <w:sz w:val="20"/>
-          <w:szCs w:val="20"/>
+          <w:sz w:val="22"/>
+          <w:szCs w:val="22"/>
         </w:rPr>
         <w:t xml:space="preserve">Stouffer, K. et al. (2023). </w:t>
       </w:r>
@@ -3664,31 +3158,31 @@
         <w:rPr>
           <w:rFonts w:ascii="Arial" w:hAnsi="Arial" w:cs="Arial"/>
           <w:i/>
-          <w:sz w:val="20"/>
-          <w:szCs w:val="20"/>
+          <w:sz w:val="22"/>
+          <w:szCs w:val="22"/>
         </w:rPr>
         <w:t xml:space="preserve">Guide to operational technology (OT) security</w:t>
       </w:r>
       <w:r>
         <w:rPr>
           <w:rFonts w:ascii="Arial" w:hAnsi="Arial" w:cs="Arial"/>
-          <w:sz w:val="20"/>
-          <w:szCs w:val="20"/>
+          <w:sz w:val="22"/>
+          <w:szCs w:val="22"/>
         </w:rPr>
         <w:t xml:space="preserve"> (NIST SP 800-82r3). https://doi.org/10.6028/NIST.SP.800-82r3</w:t>
       </w:r>
     </w:p>
     <w:p>
       <w:pPr>
-        <w:spacing w:after="60" w:line="240" w:lineRule="auto"/>
+        <w:spacing w:after="160" w:line="276" w:lineRule="auto"/>
         <w:ind w:left="567" w:hanging="567"/>
         <w:jc w:val="left"/>
       </w:pPr>
       <w:r>
         <w:rPr>
           <w:rFonts w:ascii="Arial" w:hAnsi="Arial" w:cs="Arial"/>
-          <w:sz w:val="20"/>
-          <w:szCs w:val="20"/>
+          <w:sz w:val="22"/>
+          <w:szCs w:val="22"/>
         </w:rPr>
         <w:t xml:space="preserve">Socket.IO. (2024). </w:t>
       </w:r>
@@ -3696,31 +3190,31 @@
         <w:rPr>
           <w:rFonts w:ascii="Arial" w:hAnsi="Arial" w:cs="Arial"/>
           <w:i/>
-          <w:sz w:val="20"/>
-          <w:szCs w:val="20"/>
+          <w:sz w:val="22"/>
+          <w:szCs w:val="22"/>
         </w:rPr>
         <w:t xml:space="preserve">Socket.IO documentation v4</w:t>
       </w:r>
       <w:r>
         <w:rPr>
           <w:rFonts w:ascii="Arial" w:hAnsi="Arial" w:cs="Arial"/>
-          <w:sz w:val="20"/>
-          <w:szCs w:val="20"/>
+          <w:sz w:val="22"/>
+          <w:szCs w:val="22"/>
         </w:rPr>
         <w:t xml:space="preserve">. Recuperado de https://socket.io/docs/v4/</w:t>
       </w:r>
     </w:p>
     <w:p>
       <w:pPr>
-        <w:spacing w:after="60" w:line="240" w:lineRule="auto"/>
+        <w:spacing w:after="160" w:line="276" w:lineRule="auto"/>
         <w:ind w:left="567" w:hanging="567"/>
         <w:jc w:val="left"/>
       </w:pPr>
       <w:r>
         <w:rPr>
           <w:rFonts w:ascii="Arial" w:hAnsi="Arial" w:cs="Arial"/>
-          <w:sz w:val="20"/>
-          <w:szCs w:val="20"/>
+          <w:sz w:val="22"/>
+          <w:szCs w:val="22"/>
         </w:rPr>
         <w:t xml:space="preserve">Twilio. (2024). </w:t>
       </w:r>
@@ -3728,31 +3222,31 @@
         <w:rPr>
           <w:rFonts w:ascii="Arial" w:hAnsi="Arial" w:cs="Arial"/>
           <w:i/>
-          <w:sz w:val="20"/>
-          <w:szCs w:val="20"/>
+          <w:sz w:val="22"/>
+          <w:szCs w:val="22"/>
         </w:rPr>
         <w:t xml:space="preserve">Programmable Messaging API documentation</w:t>
       </w:r>
       <w:r>
         <w:rPr>
           <w:rFonts w:ascii="Arial" w:hAnsi="Arial" w:cs="Arial"/>
-          <w:sz w:val="20"/>
-          <w:szCs w:val="20"/>
+          <w:sz w:val="22"/>
+          <w:szCs w:val="22"/>
         </w:rPr>
         <w:t xml:space="preserve">. Recuperado de https://www.twilio.com/docs/messaging</w:t>
       </w:r>
     </w:p>
     <w:p>
       <w:pPr>
-        <w:spacing w:after="60" w:line="240" w:lineRule="auto"/>
+        <w:spacing w:after="160" w:line="276" w:lineRule="auto"/>
         <w:ind w:left="567" w:hanging="567"/>
         <w:jc w:val="left"/>
       </w:pPr>
       <w:r>
         <w:rPr>
           <w:rFonts w:ascii="Arial" w:hAnsi="Arial" w:cs="Arial"/>
-          <w:sz w:val="20"/>
-          <w:szCs w:val="20"/>
+          <w:sz w:val="22"/>
+          <w:szCs w:val="22"/>
         </w:rPr>
         <w:t xml:space="preserve">Mozilla Developer Network. (2024). </w:t>
       </w:r>
@@ -3760,31 +3254,31 @@
         <w:rPr>
           <w:rFonts w:ascii="Arial" w:hAnsi="Arial" w:cs="Arial"/>
           <w:i/>
-          <w:sz w:val="20"/>
-          <w:szCs w:val="20"/>
+          <w:sz w:val="22"/>
+          <w:szCs w:val="22"/>
         </w:rPr>
         <w:t xml:space="preserve">WebRTC API</w:t>
       </w:r>
       <w:r>
         <w:rPr>
           <w:rFonts w:ascii="Arial" w:hAnsi="Arial" w:cs="Arial"/>
-          <w:sz w:val="20"/>
-          <w:szCs w:val="20"/>
+          <w:sz w:val="22"/>
+          <w:szCs w:val="22"/>
         </w:rPr>
         <w:t xml:space="preserve">. Recuperado de https://developer.mozilla.org/es/docs/Web/API/WebRTC_API</w:t>
       </w:r>
     </w:p>
     <w:p>
       <w:pPr>
-        <w:spacing w:after="60" w:line="240" w:lineRule="auto"/>
+        <w:spacing w:after="160" w:line="276" w:lineRule="auto"/>
         <w:ind w:left="567" w:hanging="567"/>
         <w:jc w:val="left"/>
       </w:pPr>
       <w:r>
         <w:rPr>
           <w:rFonts w:ascii="Arial" w:hAnsi="Arial" w:cs="Arial"/>
-          <w:sz w:val="20"/>
-          <w:szCs w:val="20"/>
+          <w:sz w:val="22"/>
+          <w:szCs w:val="22"/>
         </w:rPr>
         <w:t xml:space="preserve">Ley N° 21.719. Regula la protección y el tratamiento de los datos personales. Diario Oficial de Chile, 13 de diciembre de 2024.</w:t>
       </w:r>
@@ -4542,7 +4036,7 @@
     <w:pPr>
       <w:keepNext/>
       <w:keepLines/>
-      <w:spacing w:before="200" w:after="100"/>
+      <w:spacing w:before="120" w:after="280"/>
       <w:jc w:val="left"/>
       <w:outlineLvl w:val="0"/>
     </w:pPr>
@@ -4567,7 +4061,7 @@
     <w:pPr>
       <w:keepNext/>
       <w:keepLines/>
-      <w:spacing w:before="160" w:after="80"/>
+      <w:spacing w:before="360" w:after="160"/>
       <w:jc w:val="left"/>
       <w:outlineLvl w:val="1"/>
     </w:pPr>

</xml_diff>